<commit_message>
1. trình bày Use Case Diagram
</commit_message>
<xml_diff>
--- a/docs/J2.S.P0113.docx
+++ b/docs/J2.S.P0113.docx
@@ -1,10 +1,10 @@
 
 <file path=word/document.xml><?xml version="1.0" encoding="utf-8"?>
-<w:document xmlns:ve="http://schemas.openxmlformats.org/markup-compatibility/2006" xmlns:o="urn:schemas-microsoft-com:office:office" xmlns:r="http://schemas.openxmlformats.org/officeDocument/2006/relationships" xmlns:m="http://schemas.openxmlformats.org/officeDocument/2006/math" xmlns:v="urn:schemas-microsoft-com:vml" xmlns:wp="http://schemas.openxmlformats.org/drawingml/2006/wordprocessingDrawing" xmlns:w10="urn:schemas-microsoft-com:office:word" xmlns:w="http://schemas.openxmlformats.org/wordprocessingml/2006/main" xmlns:wne="http://schemas.microsoft.com/office/word/2006/wordml">
+<w:document xmlns:wpc="http://schemas.microsoft.com/office/word/2010/wordprocessingCanvas" xmlns:cx="http://schemas.microsoft.com/office/drawing/2014/chartex" xmlns:cx1="http://schemas.microsoft.com/office/drawing/2015/9/8/chartex" xmlns:cx2="http://schemas.microsoft.com/office/drawing/2015/10/21/chartex" xmlns:cx3="http://schemas.microsoft.com/office/drawing/2016/5/9/chartex" xmlns:cx4="http://schemas.microsoft.com/office/drawing/2016/5/10/chartex" xmlns:cx5="http://schemas.microsoft.com/office/drawing/2016/5/11/chartex" xmlns:cx6="http://schemas.microsoft.com/office/drawing/2016/5/12/chartex" xmlns:cx7="http://schemas.microsoft.com/office/drawing/2016/5/13/chartex" xmlns:cx8="http://schemas.microsoft.com/office/drawing/2016/5/14/chartex" xmlns:mc="http://schemas.openxmlformats.org/markup-compatibility/2006" xmlns:aink="http://schemas.microsoft.com/office/drawing/2016/ink" xmlns:am3d="http://schemas.microsoft.com/office/drawing/2017/model3d" xmlns:o="urn:schemas-microsoft-com:office:office" xmlns:oel="http://schemas.microsoft.com/office/2019/extlst" xmlns:r="http://schemas.openxmlformats.org/officeDocument/2006/relationships" xmlns:m="http://schemas.openxmlformats.org/officeDocument/2006/math" xmlns:v="urn:schemas-microsoft-com:vml" xmlns:wp14="http://schemas.microsoft.com/office/word/2010/wordprocessingDrawing" xmlns:wp="http://schemas.openxmlformats.org/drawingml/2006/wordprocessingDrawing" xmlns:w10="urn:schemas-microsoft-com:office:word" xmlns:w="http://schemas.openxmlformats.org/wordprocessingml/2006/main" xmlns:w14="http://schemas.microsoft.com/office/word/2010/wordml" xmlns:w15="http://schemas.microsoft.com/office/word/2012/wordml" xmlns:w16cex="http://schemas.microsoft.com/office/word/2018/wordml/cex" xmlns:w16cid="http://schemas.microsoft.com/office/word/2016/wordml/cid" xmlns:w16="http://schemas.microsoft.com/office/word/2018/wordml" xmlns:w16du="http://schemas.microsoft.com/office/word/2023/wordml/word16du" xmlns:w16sdtdh="http://schemas.microsoft.com/office/word/2020/wordml/sdtdatahash" xmlns:w16sdtfl="http://schemas.microsoft.com/office/word/2024/wordml/sdtformatlock" xmlns:w16se="http://schemas.microsoft.com/office/word/2015/wordml/symex" xmlns:wpg="http://schemas.microsoft.com/office/word/2010/wordprocessingGroup" xmlns:wpi="http://schemas.microsoft.com/office/word/2010/wordprocessingInk" xmlns:wne="http://schemas.microsoft.com/office/word/2006/wordml" xmlns:wps="http://schemas.microsoft.com/office/word/2010/wordprocessingShape" mc:Ignorable="w14 w15 w16se w16cid w16 w16cex w16sdtdh w16sdtfl w16du wp14">
   <w:body>
     <w:tbl>
       <w:tblPr>
-        <w:tblStyle w:val="TableGrid"/>
+        <w:tblStyle w:val="LiBang"/>
         <w:tblW w:w="0" w:type="auto"/>
         <w:tblBorders>
           <w:top w:val="none" w:sz="0" w:space="0" w:color="auto"/>
@@ -14,7 +14,7 @@
           <w:insideH w:val="none" w:sz="0" w:space="0" w:color="auto"/>
           <w:insideV w:val="none" w:sz="0" w:space="0" w:color="auto"/>
         </w:tblBorders>
-        <w:tblLook w:val="04A0"/>
+        <w:tblLook w:val="04A0" w:firstRow="1" w:lastRow="0" w:firstColumn="1" w:lastColumn="0" w:noHBand="0" w:noVBand="1"/>
       </w:tblPr>
       <w:tblGrid>
         <w:gridCol w:w="6655"/>
@@ -172,7 +172,6 @@
             </w:r>
           </w:p>
         </w:tc>
-        <w:bookmarkStart w:id="0" w:name="_GoBack"/>
         <w:tc>
           <w:tcPr>
             <w:tcW w:w="2245" w:type="dxa"/>
@@ -220,7 +219,6 @@
               </w:rPr>
               <w:fldChar w:fldCharType="end"/>
             </w:r>
-            <w:bookmarkEnd w:id="0"/>
           </w:p>
         </w:tc>
       </w:tr>
@@ -449,7 +447,7 @@
     </w:p>
     <w:p>
       <w:pPr>
-        <w:pStyle w:val="ListParagraph"/>
+        <w:pStyle w:val="oancuaDanhsach"/>
         <w:spacing w:after="200" w:line="276" w:lineRule="auto"/>
         <w:ind w:left="390"/>
       </w:pPr>
@@ -465,7 +463,7 @@
     </w:p>
     <w:p>
       <w:pPr>
-        <w:pStyle w:val="ListParagraph"/>
+        <w:pStyle w:val="oancuaDanhsach"/>
         <w:numPr>
           <w:ilvl w:val="0"/>
           <w:numId w:val="25"/>
@@ -478,7 +476,7 @@
     </w:p>
     <w:p>
       <w:pPr>
-        <w:pStyle w:val="ListParagraph"/>
+        <w:pStyle w:val="oancuaDanhsach"/>
         <w:numPr>
           <w:ilvl w:val="0"/>
           <w:numId w:val="25"/>
@@ -491,7 +489,7 @@
     </w:p>
     <w:p>
       <w:pPr>
-        <w:pStyle w:val="ListParagraph"/>
+        <w:pStyle w:val="oancuaDanhsach"/>
         <w:numPr>
           <w:ilvl w:val="0"/>
           <w:numId w:val="25"/>
@@ -504,7 +502,7 @@
     </w:p>
     <w:p>
       <w:pPr>
-        <w:pStyle w:val="ListParagraph"/>
+        <w:pStyle w:val="oancuaDanhsach"/>
         <w:numPr>
           <w:ilvl w:val="0"/>
           <w:numId w:val="25"/>
@@ -517,7 +515,7 @@
     </w:p>
     <w:p>
       <w:pPr>
-        <w:pStyle w:val="ListParagraph"/>
+        <w:pStyle w:val="oancuaDanhsach"/>
         <w:numPr>
           <w:ilvl w:val="0"/>
           <w:numId w:val="25"/>
@@ -530,7 +528,7 @@
     </w:p>
     <w:p>
       <w:pPr>
-        <w:pStyle w:val="ListParagraph"/>
+        <w:pStyle w:val="oancuaDanhsach"/>
         <w:numPr>
           <w:ilvl w:val="0"/>
           <w:numId w:val="25"/>
@@ -543,7 +541,7 @@
     </w:p>
     <w:p>
       <w:pPr>
-        <w:pStyle w:val="ListParagraph"/>
+        <w:pStyle w:val="oancuaDanhsach"/>
         <w:spacing w:after="200" w:line="276" w:lineRule="auto"/>
         <w:ind w:left="390"/>
       </w:pPr>
@@ -553,7 +551,7 @@
     </w:p>
     <w:p>
       <w:pPr>
-        <w:pStyle w:val="ListParagraph"/>
+        <w:pStyle w:val="oancuaDanhsach"/>
         <w:rPr>
           <w:rFonts w:eastAsiaTheme="minorEastAsia"/>
         </w:rPr>
@@ -579,7 +577,7 @@
     <w:p/>
     <w:p>
       <w:pPr>
-        <w:pStyle w:val="ListParagraph"/>
+        <w:pStyle w:val="oancuaDanhsach"/>
         <w:numPr>
           <w:ilvl w:val="0"/>
           <w:numId w:val="24"/>
@@ -589,23 +587,50 @@
       <w:r>
         <w:t>Create new book</w:t>
       </w:r>
+      <w:r>
+        <w:t xml:space="preserve"> : </w:t>
+      </w:r>
+      <w:r>
+        <w:rPr>
+          <w:i/>
+          <w:iCs/>
+          <w:color w:val="EE0000"/>
+        </w:rPr>
+        <w:t>tạo mới sách</w:t>
+      </w:r>
     </w:p>
     <w:p>
       <w:pPr>
-        <w:pStyle w:val="ListParagraph"/>
+        <w:pStyle w:val="oancuaDanhsach"/>
         <w:numPr>
           <w:ilvl w:val="0"/>
           <w:numId w:val="24"/>
         </w:numPr>
         <w:spacing w:after="200" w:line="276" w:lineRule="auto"/>
+        <w:rPr>
+          <w:i/>
+          <w:iCs/>
+          <w:color w:val="EE0000"/>
+        </w:rPr>
       </w:pPr>
       <w:r>
         <w:t>Update an existing book</w:t>
       </w:r>
+      <w:r>
+        <w:t xml:space="preserve"> : </w:t>
+      </w:r>
+      <w:r>
+        <w:rPr>
+          <w:i/>
+          <w:iCs/>
+          <w:color w:val="EE0000"/>
+        </w:rPr>
+        <w:t>cập nhật sách hiện có</w:t>
+      </w:r>
     </w:p>
     <w:p>
       <w:pPr>
-        <w:pStyle w:val="ListParagraph"/>
+        <w:pStyle w:val="oancuaDanhsach"/>
         <w:numPr>
           <w:ilvl w:val="0"/>
           <w:numId w:val="24"/>
@@ -615,10 +640,21 @@
       <w:r>
         <w:t>Remove an existing book</w:t>
       </w:r>
+      <w:r>
+        <w:t xml:space="preserve"> : </w:t>
+      </w:r>
+      <w:r>
+        <w:rPr>
+          <w:i/>
+          <w:iCs/>
+          <w:color w:val="EE0000"/>
+        </w:rPr>
+        <w:t>xóa sách hiện có</w:t>
+      </w:r>
     </w:p>
     <w:p>
       <w:pPr>
-        <w:pStyle w:val="ListParagraph"/>
+        <w:pStyle w:val="oancuaDanhsach"/>
         <w:numPr>
           <w:ilvl w:val="0"/>
           <w:numId w:val="24"/>
@@ -627,6 +663,17 @@
       </w:pPr>
       <w:r>
         <w:t>Display an existing book information</w:t>
+      </w:r>
+      <w:r>
+        <w:t xml:space="preserve"> : </w:t>
+      </w:r>
+      <w:r>
+        <w:rPr>
+          <w:i/>
+          <w:iCs/>
+          <w:color w:val="EE0000"/>
+        </w:rPr>
+        <w:t>hiển thị thông tin sách hiện có</w:t>
       </w:r>
     </w:p>
     <w:p>
@@ -653,7 +700,7 @@
     </w:p>
     <w:p>
       <w:pPr>
-        <w:pStyle w:val="ListParagraph"/>
+        <w:pStyle w:val="oancuaDanhsach"/>
         <w:ind w:left="1080"/>
       </w:pPr>
       <w:r>
@@ -662,19 +709,19 @@
     </w:p>
     <w:p>
       <w:pPr>
-        <w:pStyle w:val="ListParagraph"/>
+        <w:pStyle w:val="oancuaDanhsach"/>
         <w:ind w:left="1080"/>
       </w:pPr>
     </w:p>
     <w:p>
       <w:pPr>
-        <w:pStyle w:val="ListParagraph"/>
+        <w:pStyle w:val="oancuaDanhsach"/>
         <w:ind w:left="1080"/>
       </w:pPr>
     </w:p>
     <w:p>
       <w:pPr>
-        <w:pStyle w:val="ListParagraph"/>
+        <w:pStyle w:val="oancuaDanhsach"/>
         <w:ind w:left="1800"/>
       </w:pPr>
       <w:r>
@@ -682,7 +729,7 @@
           <w:noProof/>
         </w:rPr>
         <w:drawing>
-          <wp:anchor distT="0" distB="0" distL="114300" distR="114300" simplePos="0" relativeHeight="251659264" behindDoc="1" locked="0" layoutInCell="1" allowOverlap="1">
+          <wp:anchor distT="0" distB="0" distL="114300" distR="114300" simplePos="0" relativeHeight="251659264" behindDoc="1" locked="0" layoutInCell="1" allowOverlap="1" wp14:anchorId="10E03A1B" wp14:editId="0521D542">
             <wp:simplePos x="0" y="0"/>
             <wp:positionH relativeFrom="column">
               <wp:posOffset>1295400</wp:posOffset>
@@ -738,97 +785,97 @@
     </w:p>
     <w:p>
       <w:pPr>
-        <w:pStyle w:val="ListParagraph"/>
+        <w:pStyle w:val="oancuaDanhsach"/>
         <w:ind w:left="1800"/>
       </w:pPr>
     </w:p>
     <w:p>
       <w:pPr>
-        <w:pStyle w:val="ListParagraph"/>
+        <w:pStyle w:val="oancuaDanhsach"/>
         <w:ind w:left="1800"/>
       </w:pPr>
     </w:p>
     <w:p>
       <w:pPr>
-        <w:pStyle w:val="ListParagraph"/>
+        <w:pStyle w:val="oancuaDanhsach"/>
         <w:ind w:left="1800"/>
       </w:pPr>
     </w:p>
     <w:p>
       <w:pPr>
-        <w:pStyle w:val="ListParagraph"/>
+        <w:pStyle w:val="oancuaDanhsach"/>
         <w:ind w:left="1800"/>
       </w:pPr>
     </w:p>
     <w:p>
       <w:pPr>
-        <w:pStyle w:val="ListParagraph"/>
+        <w:pStyle w:val="oancuaDanhsach"/>
         <w:ind w:left="1800"/>
       </w:pPr>
     </w:p>
     <w:p>
       <w:pPr>
-        <w:pStyle w:val="ListParagraph"/>
+        <w:pStyle w:val="oancuaDanhsach"/>
         <w:ind w:left="1800"/>
       </w:pPr>
     </w:p>
     <w:p>
       <w:pPr>
-        <w:pStyle w:val="ListParagraph"/>
+        <w:pStyle w:val="oancuaDanhsach"/>
         <w:ind w:left="1800"/>
       </w:pPr>
     </w:p>
     <w:p>
       <w:pPr>
-        <w:pStyle w:val="ListParagraph"/>
+        <w:pStyle w:val="oancuaDanhsach"/>
         <w:ind w:left="1800"/>
       </w:pPr>
     </w:p>
     <w:p>
       <w:pPr>
-        <w:pStyle w:val="ListParagraph"/>
+        <w:pStyle w:val="oancuaDanhsach"/>
         <w:ind w:left="1800"/>
       </w:pPr>
     </w:p>
     <w:p>
       <w:pPr>
-        <w:pStyle w:val="ListParagraph"/>
+        <w:pStyle w:val="oancuaDanhsach"/>
         <w:ind w:left="1800"/>
       </w:pPr>
     </w:p>
     <w:p>
       <w:pPr>
-        <w:pStyle w:val="ListParagraph"/>
+        <w:pStyle w:val="oancuaDanhsach"/>
         <w:ind w:left="1800"/>
       </w:pPr>
     </w:p>
     <w:p>
       <w:pPr>
-        <w:pStyle w:val="ListParagraph"/>
+        <w:pStyle w:val="oancuaDanhsach"/>
         <w:ind w:left="1800"/>
       </w:pPr>
     </w:p>
     <w:p>
       <w:pPr>
-        <w:pStyle w:val="ListParagraph"/>
+        <w:pStyle w:val="oancuaDanhsach"/>
         <w:ind w:left="1800"/>
       </w:pPr>
     </w:p>
     <w:p>
       <w:pPr>
-        <w:pStyle w:val="ListParagraph"/>
+        <w:pStyle w:val="oancuaDanhsach"/>
         <w:ind w:left="1800"/>
       </w:pPr>
     </w:p>
     <w:p>
       <w:pPr>
-        <w:pStyle w:val="ListParagraph"/>
+        <w:pStyle w:val="oancuaDanhsach"/>
         <w:ind w:left="1800"/>
       </w:pPr>
     </w:p>
     <w:p>
       <w:pPr>
-        <w:pStyle w:val="ListParagraph"/>
+        <w:pStyle w:val="oancuaDanhsach"/>
         <w:numPr>
           <w:ilvl w:val="0"/>
           <w:numId w:val="25"/>
@@ -841,7 +888,16 @@
     </w:p>
     <w:p>
       <w:pPr>
-        <w:pStyle w:val="ListParagraph"/>
+        <w:pStyle w:val="oancuaDanhsach"/>
+        <w:numPr>
+          <w:ilvl w:val="0"/>
+          <w:numId w:val="27"/>
+        </w:numPr>
+      </w:pPr>
+    </w:p>
+    <w:p>
+      <w:pPr>
+        <w:pStyle w:val="oancuaDanhsach"/>
         <w:numPr>
           <w:ilvl w:val="1"/>
           <w:numId w:val="25"/>
@@ -877,7 +933,7 @@
     </w:p>
     <w:p>
       <w:pPr>
-        <w:pStyle w:val="ListParagraph"/>
+        <w:pStyle w:val="oancuaDanhsach"/>
         <w:numPr>
           <w:ilvl w:val="0"/>
           <w:numId w:val="25"/>
@@ -889,7 +945,67 @@
     </w:p>
     <w:p>
       <w:pPr>
-        <w:pStyle w:val="ListParagraph"/>
+        <w:pStyle w:val="oancuaDanhsach"/>
+        <w:numPr>
+          <w:ilvl w:val="0"/>
+          <w:numId w:val="26"/>
+        </w:numPr>
+        <w:rPr>
+          <w:i/>
+          <w:iCs/>
+          <w:color w:val="EE0000"/>
+        </w:rPr>
+      </w:pPr>
+      <w:r>
+        <w:rPr>
+          <w:i/>
+          <w:iCs/>
+          <w:color w:val="EE0000"/>
+        </w:rPr>
+        <w:t xml:space="preserve">Click </w:t>
+      </w:r>
+      <w:r>
+        <w:rPr>
+          <w:b/>
+          <w:bCs/>
+          <w:i/>
+          <w:iCs/>
+          <w:color w:val="EE0000"/>
+        </w:rPr>
+        <w:t>Exit button</w:t>
+      </w:r>
+      <w:r>
+        <w:rPr>
+          <w:b/>
+          <w:bCs/>
+          <w:i/>
+          <w:iCs/>
+          <w:color w:val="EE0000"/>
+        </w:rPr>
+        <w:t xml:space="preserve"> </w:t>
+      </w:r>
+      <w:r>
+        <w:rPr>
+          <w:i/>
+          <w:iCs/>
+          <w:color w:val="EE0000"/>
+        </w:rPr>
+        <w:t>chương trình sẽ kết thúc</w:t>
+      </w:r>
+      <w:r>
+        <w:rPr>
+          <w:b/>
+          <w:bCs/>
+          <w:i/>
+          <w:iCs/>
+          <w:color w:val="EE0000"/>
+        </w:rPr>
+        <w:t>.</w:t>
+      </w:r>
+    </w:p>
+    <w:p>
+      <w:pPr>
+        <w:pStyle w:val="oancuaDanhsach"/>
         <w:ind w:left="1800"/>
       </w:pPr>
     </w:p>
@@ -923,8 +1039,8 @@
 </file>
 
 <file path=word/numbering.xml><?xml version="1.0" encoding="utf-8"?>
-<w:numbering xmlns:ve="http://schemas.openxmlformats.org/markup-compatibility/2006" xmlns:o="urn:schemas-microsoft-com:office:office" xmlns:r="http://schemas.openxmlformats.org/officeDocument/2006/relationships" xmlns:m="http://schemas.openxmlformats.org/officeDocument/2006/math" xmlns:v="urn:schemas-microsoft-com:vml" xmlns:wp="http://schemas.openxmlformats.org/drawingml/2006/wordprocessingDrawing" xmlns:w10="urn:schemas-microsoft-com:office:word" xmlns:w="http://schemas.openxmlformats.org/wordprocessingml/2006/main" xmlns:wne="http://schemas.microsoft.com/office/word/2006/wordml">
-  <w:abstractNum w:abstractNumId="0">
+<w:numbering xmlns:wpc="http://schemas.microsoft.com/office/word/2010/wordprocessingCanvas" xmlns:cx="http://schemas.microsoft.com/office/drawing/2014/chartex" xmlns:cx1="http://schemas.microsoft.com/office/drawing/2015/9/8/chartex" xmlns:cx2="http://schemas.microsoft.com/office/drawing/2015/10/21/chartex" xmlns:cx3="http://schemas.microsoft.com/office/drawing/2016/5/9/chartex" xmlns:cx4="http://schemas.microsoft.com/office/drawing/2016/5/10/chartex" xmlns:cx5="http://schemas.microsoft.com/office/drawing/2016/5/11/chartex" xmlns:cx6="http://schemas.microsoft.com/office/drawing/2016/5/12/chartex" xmlns:cx7="http://schemas.microsoft.com/office/drawing/2016/5/13/chartex" xmlns:cx8="http://schemas.microsoft.com/office/drawing/2016/5/14/chartex" xmlns:mc="http://schemas.openxmlformats.org/markup-compatibility/2006" xmlns:aink="http://schemas.microsoft.com/office/drawing/2016/ink" xmlns:am3d="http://schemas.microsoft.com/office/drawing/2017/model3d" xmlns:o="urn:schemas-microsoft-com:office:office" xmlns:oel="http://schemas.microsoft.com/office/2019/extlst" xmlns:r="http://schemas.openxmlformats.org/officeDocument/2006/relationships" xmlns:m="http://schemas.openxmlformats.org/officeDocument/2006/math" xmlns:v="urn:schemas-microsoft-com:vml" xmlns:wp14="http://schemas.microsoft.com/office/word/2010/wordprocessingDrawing" xmlns:wp="http://schemas.openxmlformats.org/drawingml/2006/wordprocessingDrawing" xmlns:w10="urn:schemas-microsoft-com:office:word" xmlns:w="http://schemas.openxmlformats.org/wordprocessingml/2006/main" xmlns:w14="http://schemas.microsoft.com/office/word/2010/wordml" xmlns:w15="http://schemas.microsoft.com/office/word/2012/wordml" xmlns:w16cex="http://schemas.microsoft.com/office/word/2018/wordml/cex" xmlns:w16cid="http://schemas.microsoft.com/office/word/2016/wordml/cid" xmlns:w16="http://schemas.microsoft.com/office/word/2018/wordml" xmlns:w16du="http://schemas.microsoft.com/office/word/2023/wordml/word16du" xmlns:w16sdtdh="http://schemas.microsoft.com/office/word/2020/wordml/sdtdatahash" xmlns:w16sdtfl="http://schemas.microsoft.com/office/word/2024/wordml/sdtformatlock" xmlns:w16se="http://schemas.microsoft.com/office/word/2015/wordml/symex" xmlns:wpg="http://schemas.microsoft.com/office/word/2010/wordprocessingGroup" xmlns:wpi="http://schemas.microsoft.com/office/word/2010/wordprocessingInk" xmlns:wne="http://schemas.microsoft.com/office/word/2006/wordml" xmlns:wps="http://schemas.microsoft.com/office/word/2010/wordprocessingShape" mc:Ignorable="w14 w15 w16se w16cid w16 w16cex w16sdtdh w16sdtfl w16du wp14">
+  <w:abstractNum w:abstractNumId="0" w15:restartNumberingAfterBreak="0">
     <w:nsid w:val="0B9040A2"/>
     <w:multiLevelType w:val="hybridMultilevel"/>
     <w:tmpl w:val="85244EFC"/>
@@ -1037,7 +1153,7 @@
       </w:rPr>
     </w:lvl>
   </w:abstractNum>
-  <w:abstractNum w:abstractNumId="1">
+  <w:abstractNum w:abstractNumId="1" w15:restartNumberingAfterBreak="0">
     <w:nsid w:val="1B6117B3"/>
     <w:multiLevelType w:val="hybridMultilevel"/>
     <w:tmpl w:val="DDA0C84E"/>
@@ -1150,7 +1266,7 @@
       </w:rPr>
     </w:lvl>
   </w:abstractNum>
-  <w:abstractNum w:abstractNumId="2">
+  <w:abstractNum w:abstractNumId="2" w15:restartNumberingAfterBreak="0">
     <w:nsid w:val="1BCF0EE1"/>
     <w:multiLevelType w:val="hybridMultilevel"/>
     <w:tmpl w:val="EC7CFA18"/>
@@ -1263,7 +1379,7 @@
       </w:rPr>
     </w:lvl>
   </w:abstractNum>
-  <w:abstractNum w:abstractNumId="3">
+  <w:abstractNum w:abstractNumId="3" w15:restartNumberingAfterBreak="0">
     <w:nsid w:val="1C9C4383"/>
     <w:multiLevelType w:val="hybridMultilevel"/>
     <w:tmpl w:val="415CDF92"/>
@@ -1352,7 +1468,7 @@
       </w:pPr>
     </w:lvl>
   </w:abstractNum>
-  <w:abstractNum w:abstractNumId="4">
+  <w:abstractNum w:abstractNumId="4" w15:restartNumberingAfterBreak="0">
     <w:nsid w:val="1EF0045F"/>
     <w:multiLevelType w:val="hybridMultilevel"/>
     <w:tmpl w:val="84A2C120"/>
@@ -1465,7 +1581,7 @@
       </w:rPr>
     </w:lvl>
   </w:abstractNum>
-  <w:abstractNum w:abstractNumId="5">
+  <w:abstractNum w:abstractNumId="5" w15:restartNumberingAfterBreak="0">
     <w:nsid w:val="22764FC8"/>
     <w:multiLevelType w:val="hybridMultilevel"/>
     <w:tmpl w:val="9F6EE456"/>
@@ -1554,7 +1670,7 @@
       </w:pPr>
     </w:lvl>
   </w:abstractNum>
-  <w:abstractNum w:abstractNumId="6">
+  <w:abstractNum w:abstractNumId="6" w15:restartNumberingAfterBreak="0">
     <w:nsid w:val="23746029"/>
     <w:multiLevelType w:val="hybridMultilevel"/>
     <w:tmpl w:val="6DAA9D24"/>
@@ -1643,7 +1759,7 @@
       </w:pPr>
     </w:lvl>
   </w:abstractNum>
-  <w:abstractNum w:abstractNumId="7">
+  <w:abstractNum w:abstractNumId="7" w15:restartNumberingAfterBreak="0">
     <w:nsid w:val="2B67423C"/>
     <w:multiLevelType w:val="hybridMultilevel"/>
     <w:tmpl w:val="4830B466"/>
@@ -1756,7 +1872,7 @@
       </w:rPr>
     </w:lvl>
   </w:abstractNum>
-  <w:abstractNum w:abstractNumId="8">
+  <w:abstractNum w:abstractNumId="8" w15:restartNumberingAfterBreak="0">
     <w:nsid w:val="2B836975"/>
     <w:multiLevelType w:val="hybridMultilevel"/>
     <w:tmpl w:val="1B88B568"/>
@@ -1845,7 +1961,7 @@
       </w:pPr>
     </w:lvl>
   </w:abstractNum>
-  <w:abstractNum w:abstractNumId="9">
+  <w:abstractNum w:abstractNumId="9" w15:restartNumberingAfterBreak="0">
     <w:nsid w:val="362B4E99"/>
     <w:multiLevelType w:val="hybridMultilevel"/>
     <w:tmpl w:val="09541AB4"/>
@@ -1934,7 +2050,7 @@
       </w:pPr>
     </w:lvl>
   </w:abstractNum>
-  <w:abstractNum w:abstractNumId="10">
+  <w:abstractNum w:abstractNumId="10" w15:restartNumberingAfterBreak="0">
     <w:nsid w:val="37D40303"/>
     <w:multiLevelType w:val="hybridMultilevel"/>
     <w:tmpl w:val="EACE6F8C"/>
@@ -2024,7 +2140,7 @@
       </w:pPr>
     </w:lvl>
   </w:abstractNum>
-  <w:abstractNum w:abstractNumId="11">
+  <w:abstractNum w:abstractNumId="11" w15:restartNumberingAfterBreak="0">
     <w:nsid w:val="393A12D2"/>
     <w:multiLevelType w:val="hybridMultilevel"/>
     <w:tmpl w:val="AC722DE8"/>
@@ -2113,7 +2229,7 @@
       </w:pPr>
     </w:lvl>
   </w:abstractNum>
-  <w:abstractNum w:abstractNumId="12">
+  <w:abstractNum w:abstractNumId="12" w15:restartNumberingAfterBreak="0">
     <w:nsid w:val="399136C8"/>
     <w:multiLevelType w:val="hybridMultilevel"/>
     <w:tmpl w:val="A7E6B84A"/>
@@ -2202,7 +2318,7 @@
       </w:pPr>
     </w:lvl>
   </w:abstractNum>
-  <w:abstractNum w:abstractNumId="13">
+  <w:abstractNum w:abstractNumId="13" w15:restartNumberingAfterBreak="0">
     <w:nsid w:val="46FB49A7"/>
     <w:multiLevelType w:val="hybridMultilevel"/>
     <w:tmpl w:val="63227DB6"/>
@@ -2291,7 +2407,120 @@
       </w:pPr>
     </w:lvl>
   </w:abstractNum>
-  <w:abstractNum w:abstractNumId="14">
+  <w:abstractNum w:abstractNumId="14" w15:restartNumberingAfterBreak="0">
+    <w:nsid w:val="4D1029AF"/>
+    <w:multiLevelType w:val="hybridMultilevel"/>
+    <w:tmpl w:val="23EEDC06"/>
+    <w:lvl w:ilvl="0" w:tplc="C08C52F6">
+      <w:start w:val="2"/>
+      <w:numFmt w:val="bullet"/>
+      <w:lvlText w:val=""/>
+      <w:lvlJc w:val="left"/>
+      <w:pPr>
+        <w:ind w:left="1110" w:hanging="360"/>
+      </w:pPr>
+      <w:rPr>
+        <w:rFonts w:ascii="Wingdings" w:eastAsiaTheme="minorHAnsi" w:hAnsi="Wingdings" w:cstheme="minorBidi" w:hint="default"/>
+      </w:rPr>
+    </w:lvl>
+    <w:lvl w:ilvl="1" w:tplc="04090003" w:tentative="1">
+      <w:start w:val="1"/>
+      <w:numFmt w:val="bullet"/>
+      <w:lvlText w:val="o"/>
+      <w:lvlJc w:val="left"/>
+      <w:pPr>
+        <w:ind w:left="1830" w:hanging="360"/>
+      </w:pPr>
+      <w:rPr>
+        <w:rFonts w:ascii="Courier New" w:hAnsi="Courier New" w:cs="Courier New" w:hint="default"/>
+      </w:rPr>
+    </w:lvl>
+    <w:lvl w:ilvl="2" w:tplc="04090005" w:tentative="1">
+      <w:start w:val="1"/>
+      <w:numFmt w:val="bullet"/>
+      <w:lvlText w:val=""/>
+      <w:lvlJc w:val="left"/>
+      <w:pPr>
+        <w:ind w:left="2550" w:hanging="360"/>
+      </w:pPr>
+      <w:rPr>
+        <w:rFonts w:ascii="Wingdings" w:hAnsi="Wingdings" w:hint="default"/>
+      </w:rPr>
+    </w:lvl>
+    <w:lvl w:ilvl="3" w:tplc="04090001" w:tentative="1">
+      <w:start w:val="1"/>
+      <w:numFmt w:val="bullet"/>
+      <w:lvlText w:val=""/>
+      <w:lvlJc w:val="left"/>
+      <w:pPr>
+        <w:ind w:left="3270" w:hanging="360"/>
+      </w:pPr>
+      <w:rPr>
+        <w:rFonts w:ascii="Symbol" w:hAnsi="Symbol" w:hint="default"/>
+      </w:rPr>
+    </w:lvl>
+    <w:lvl w:ilvl="4" w:tplc="04090003" w:tentative="1">
+      <w:start w:val="1"/>
+      <w:numFmt w:val="bullet"/>
+      <w:lvlText w:val="o"/>
+      <w:lvlJc w:val="left"/>
+      <w:pPr>
+        <w:ind w:left="3990" w:hanging="360"/>
+      </w:pPr>
+      <w:rPr>
+        <w:rFonts w:ascii="Courier New" w:hAnsi="Courier New" w:cs="Courier New" w:hint="default"/>
+      </w:rPr>
+    </w:lvl>
+    <w:lvl w:ilvl="5" w:tplc="04090005" w:tentative="1">
+      <w:start w:val="1"/>
+      <w:numFmt w:val="bullet"/>
+      <w:lvlText w:val=""/>
+      <w:lvlJc w:val="left"/>
+      <w:pPr>
+        <w:ind w:left="4710" w:hanging="360"/>
+      </w:pPr>
+      <w:rPr>
+        <w:rFonts w:ascii="Wingdings" w:hAnsi="Wingdings" w:hint="default"/>
+      </w:rPr>
+    </w:lvl>
+    <w:lvl w:ilvl="6" w:tplc="04090001" w:tentative="1">
+      <w:start w:val="1"/>
+      <w:numFmt w:val="bullet"/>
+      <w:lvlText w:val=""/>
+      <w:lvlJc w:val="left"/>
+      <w:pPr>
+        <w:ind w:left="5430" w:hanging="360"/>
+      </w:pPr>
+      <w:rPr>
+        <w:rFonts w:ascii="Symbol" w:hAnsi="Symbol" w:hint="default"/>
+      </w:rPr>
+    </w:lvl>
+    <w:lvl w:ilvl="7" w:tplc="04090003" w:tentative="1">
+      <w:start w:val="1"/>
+      <w:numFmt w:val="bullet"/>
+      <w:lvlText w:val="o"/>
+      <w:lvlJc w:val="left"/>
+      <w:pPr>
+        <w:ind w:left="6150" w:hanging="360"/>
+      </w:pPr>
+      <w:rPr>
+        <w:rFonts w:ascii="Courier New" w:hAnsi="Courier New" w:cs="Courier New" w:hint="default"/>
+      </w:rPr>
+    </w:lvl>
+    <w:lvl w:ilvl="8" w:tplc="04090005" w:tentative="1">
+      <w:start w:val="1"/>
+      <w:numFmt w:val="bullet"/>
+      <w:lvlText w:val=""/>
+      <w:lvlJc w:val="left"/>
+      <w:pPr>
+        <w:ind w:left="6870" w:hanging="360"/>
+      </w:pPr>
+      <w:rPr>
+        <w:rFonts w:ascii="Wingdings" w:hAnsi="Wingdings" w:hint="default"/>
+      </w:rPr>
+    </w:lvl>
+  </w:abstractNum>
+  <w:abstractNum w:abstractNumId="15" w15:restartNumberingAfterBreak="0">
     <w:nsid w:val="50290900"/>
     <w:multiLevelType w:val="hybridMultilevel"/>
     <w:tmpl w:val="795E7602"/>
@@ -2380,7 +2609,7 @@
       </w:pPr>
     </w:lvl>
   </w:abstractNum>
-  <w:abstractNum w:abstractNumId="15">
+  <w:abstractNum w:abstractNumId="16" w15:restartNumberingAfterBreak="0">
     <w:nsid w:val="59E27393"/>
     <w:multiLevelType w:val="hybridMultilevel"/>
     <w:tmpl w:val="61461212"/>
@@ -2469,7 +2698,7 @@
       </w:pPr>
     </w:lvl>
   </w:abstractNum>
-  <w:abstractNum w:abstractNumId="16">
+  <w:abstractNum w:abstractNumId="17" w15:restartNumberingAfterBreak="0">
     <w:nsid w:val="5D5B3EFA"/>
     <w:multiLevelType w:val="hybridMultilevel"/>
     <w:tmpl w:val="A09E71C6"/>
@@ -2582,7 +2811,120 @@
       </w:rPr>
     </w:lvl>
   </w:abstractNum>
-  <w:abstractNum w:abstractNumId="17">
+  <w:abstractNum w:abstractNumId="18" w15:restartNumberingAfterBreak="0">
+    <w:nsid w:val="5FA45E15"/>
+    <w:multiLevelType w:val="hybridMultilevel"/>
+    <w:tmpl w:val="1FBE24D4"/>
+    <w:lvl w:ilvl="0" w:tplc="4184DDA2">
+      <w:start w:val="2"/>
+      <w:numFmt w:val="bullet"/>
+      <w:lvlText w:val=""/>
+      <w:lvlJc w:val="left"/>
+      <w:pPr>
+        <w:ind w:left="1110" w:hanging="360"/>
+      </w:pPr>
+      <w:rPr>
+        <w:rFonts w:ascii="Wingdings" w:eastAsiaTheme="minorHAnsi" w:hAnsi="Wingdings" w:cstheme="minorBidi" w:hint="default"/>
+      </w:rPr>
+    </w:lvl>
+    <w:lvl w:ilvl="1" w:tplc="04090003" w:tentative="1">
+      <w:start w:val="1"/>
+      <w:numFmt w:val="bullet"/>
+      <w:lvlText w:val="o"/>
+      <w:lvlJc w:val="left"/>
+      <w:pPr>
+        <w:ind w:left="1830" w:hanging="360"/>
+      </w:pPr>
+      <w:rPr>
+        <w:rFonts w:ascii="Courier New" w:hAnsi="Courier New" w:cs="Courier New" w:hint="default"/>
+      </w:rPr>
+    </w:lvl>
+    <w:lvl w:ilvl="2" w:tplc="04090005" w:tentative="1">
+      <w:start w:val="1"/>
+      <w:numFmt w:val="bullet"/>
+      <w:lvlText w:val=""/>
+      <w:lvlJc w:val="left"/>
+      <w:pPr>
+        <w:ind w:left="2550" w:hanging="360"/>
+      </w:pPr>
+      <w:rPr>
+        <w:rFonts w:ascii="Wingdings" w:hAnsi="Wingdings" w:hint="default"/>
+      </w:rPr>
+    </w:lvl>
+    <w:lvl w:ilvl="3" w:tplc="04090001" w:tentative="1">
+      <w:start w:val="1"/>
+      <w:numFmt w:val="bullet"/>
+      <w:lvlText w:val=""/>
+      <w:lvlJc w:val="left"/>
+      <w:pPr>
+        <w:ind w:left="3270" w:hanging="360"/>
+      </w:pPr>
+      <w:rPr>
+        <w:rFonts w:ascii="Symbol" w:hAnsi="Symbol" w:hint="default"/>
+      </w:rPr>
+    </w:lvl>
+    <w:lvl w:ilvl="4" w:tplc="04090003" w:tentative="1">
+      <w:start w:val="1"/>
+      <w:numFmt w:val="bullet"/>
+      <w:lvlText w:val="o"/>
+      <w:lvlJc w:val="left"/>
+      <w:pPr>
+        <w:ind w:left="3990" w:hanging="360"/>
+      </w:pPr>
+      <w:rPr>
+        <w:rFonts w:ascii="Courier New" w:hAnsi="Courier New" w:cs="Courier New" w:hint="default"/>
+      </w:rPr>
+    </w:lvl>
+    <w:lvl w:ilvl="5" w:tplc="04090005" w:tentative="1">
+      <w:start w:val="1"/>
+      <w:numFmt w:val="bullet"/>
+      <w:lvlText w:val=""/>
+      <w:lvlJc w:val="left"/>
+      <w:pPr>
+        <w:ind w:left="4710" w:hanging="360"/>
+      </w:pPr>
+      <w:rPr>
+        <w:rFonts w:ascii="Wingdings" w:hAnsi="Wingdings" w:hint="default"/>
+      </w:rPr>
+    </w:lvl>
+    <w:lvl w:ilvl="6" w:tplc="04090001" w:tentative="1">
+      <w:start w:val="1"/>
+      <w:numFmt w:val="bullet"/>
+      <w:lvlText w:val=""/>
+      <w:lvlJc w:val="left"/>
+      <w:pPr>
+        <w:ind w:left="5430" w:hanging="360"/>
+      </w:pPr>
+      <w:rPr>
+        <w:rFonts w:ascii="Symbol" w:hAnsi="Symbol" w:hint="default"/>
+      </w:rPr>
+    </w:lvl>
+    <w:lvl w:ilvl="7" w:tplc="04090003" w:tentative="1">
+      <w:start w:val="1"/>
+      <w:numFmt w:val="bullet"/>
+      <w:lvlText w:val="o"/>
+      <w:lvlJc w:val="left"/>
+      <w:pPr>
+        <w:ind w:left="6150" w:hanging="360"/>
+      </w:pPr>
+      <w:rPr>
+        <w:rFonts w:ascii="Courier New" w:hAnsi="Courier New" w:cs="Courier New" w:hint="default"/>
+      </w:rPr>
+    </w:lvl>
+    <w:lvl w:ilvl="8" w:tplc="04090005" w:tentative="1">
+      <w:start w:val="1"/>
+      <w:numFmt w:val="bullet"/>
+      <w:lvlText w:val=""/>
+      <w:lvlJc w:val="left"/>
+      <w:pPr>
+        <w:ind w:left="6870" w:hanging="360"/>
+      </w:pPr>
+      <w:rPr>
+        <w:rFonts w:ascii="Wingdings" w:hAnsi="Wingdings" w:hint="default"/>
+      </w:rPr>
+    </w:lvl>
+  </w:abstractNum>
+  <w:abstractNum w:abstractNumId="19" w15:restartNumberingAfterBreak="0">
     <w:nsid w:val="602C53FE"/>
     <w:multiLevelType w:val="hybridMultilevel"/>
     <w:tmpl w:val="E12608B0"/>
@@ -2695,7 +3037,7 @@
       </w:rPr>
     </w:lvl>
   </w:abstractNum>
-  <w:abstractNum w:abstractNumId="18">
+  <w:abstractNum w:abstractNumId="20" w15:restartNumberingAfterBreak="0">
     <w:nsid w:val="62F06FD0"/>
     <w:multiLevelType w:val="hybridMultilevel"/>
     <w:tmpl w:val="63227DB6"/>
@@ -2784,7 +3126,7 @@
       </w:pPr>
     </w:lvl>
   </w:abstractNum>
-  <w:abstractNum w:abstractNumId="19">
+  <w:abstractNum w:abstractNumId="21" w15:restartNumberingAfterBreak="0">
     <w:nsid w:val="6B8346A9"/>
     <w:multiLevelType w:val="hybridMultilevel"/>
     <w:tmpl w:val="C986CCA0"/>
@@ -2897,7 +3239,7 @@
       </w:rPr>
     </w:lvl>
   </w:abstractNum>
-  <w:abstractNum w:abstractNumId="20">
+  <w:abstractNum w:abstractNumId="22" w15:restartNumberingAfterBreak="0">
     <w:nsid w:val="6BAF5A49"/>
     <w:multiLevelType w:val="hybridMultilevel"/>
     <w:tmpl w:val="BAEEE5D2"/>
@@ -3010,7 +3352,7 @@
       </w:rPr>
     </w:lvl>
   </w:abstractNum>
-  <w:abstractNum w:abstractNumId="21">
+  <w:abstractNum w:abstractNumId="23" w15:restartNumberingAfterBreak="0">
     <w:nsid w:val="6EF21679"/>
     <w:multiLevelType w:val="hybridMultilevel"/>
     <w:tmpl w:val="D3DC26DA"/>
@@ -3099,7 +3441,7 @@
       </w:pPr>
     </w:lvl>
   </w:abstractNum>
-  <w:abstractNum w:abstractNumId="22">
+  <w:abstractNum w:abstractNumId="24" w15:restartNumberingAfterBreak="0">
     <w:nsid w:val="6FCB1133"/>
     <w:multiLevelType w:val="hybridMultilevel"/>
     <w:tmpl w:val="86C0FF42"/>
@@ -3188,7 +3530,7 @@
       </w:pPr>
     </w:lvl>
   </w:abstractNum>
-  <w:abstractNum w:abstractNumId="23">
+  <w:abstractNum w:abstractNumId="25" w15:restartNumberingAfterBreak="0">
     <w:nsid w:val="71D25FA6"/>
     <w:multiLevelType w:val="hybridMultilevel"/>
     <w:tmpl w:val="327ABE26"/>
@@ -3300,7 +3642,7 @@
       </w:rPr>
     </w:lvl>
   </w:abstractNum>
-  <w:abstractNum w:abstractNumId="24">
+  <w:abstractNum w:abstractNumId="26" w15:restartNumberingAfterBreak="0">
     <w:nsid w:val="7A0B5D73"/>
     <w:multiLevelType w:val="hybridMultilevel"/>
     <w:tmpl w:val="020A96E8"/>
@@ -3412,86 +3754,92 @@
       </w:rPr>
     </w:lvl>
   </w:abstractNum>
-  <w:num w:numId="1">
+  <w:num w:numId="1" w16cid:durableId="267127774">
+    <w:abstractNumId w:val="22"/>
+  </w:num>
+  <w:num w:numId="2" w16cid:durableId="231163657">
+    <w:abstractNumId w:val="19"/>
+  </w:num>
+  <w:num w:numId="3" w16cid:durableId="2104839343">
+    <w:abstractNumId w:val="2"/>
+  </w:num>
+  <w:num w:numId="4" w16cid:durableId="773208588">
+    <w:abstractNumId w:val="21"/>
+  </w:num>
+  <w:num w:numId="5" w16cid:durableId="399208660">
+    <w:abstractNumId w:val="8"/>
+  </w:num>
+  <w:num w:numId="6" w16cid:durableId="868640287">
+    <w:abstractNumId w:val="0"/>
+  </w:num>
+  <w:num w:numId="7" w16cid:durableId="1793396745">
+    <w:abstractNumId w:val="10"/>
+  </w:num>
+  <w:num w:numId="8" w16cid:durableId="811212696">
+    <w:abstractNumId w:val="7"/>
+  </w:num>
+  <w:num w:numId="9" w16cid:durableId="163935385">
+    <w:abstractNumId w:val="4"/>
+  </w:num>
+  <w:num w:numId="10" w16cid:durableId="1166478745">
+    <w:abstractNumId w:val="1"/>
+  </w:num>
+  <w:num w:numId="11" w16cid:durableId="1223562744">
+    <w:abstractNumId w:val="9"/>
+  </w:num>
+  <w:num w:numId="12" w16cid:durableId="981932717">
+    <w:abstractNumId w:val="23"/>
+  </w:num>
+  <w:num w:numId="13" w16cid:durableId="1775176067">
+    <w:abstractNumId w:val="6"/>
+  </w:num>
+  <w:num w:numId="14" w16cid:durableId="452986271">
+    <w:abstractNumId w:val="25"/>
+  </w:num>
+  <w:num w:numId="15" w16cid:durableId="322440540">
+    <w:abstractNumId w:val="12"/>
+  </w:num>
+  <w:num w:numId="16" w16cid:durableId="1478381998">
+    <w:abstractNumId w:val="11"/>
+  </w:num>
+  <w:num w:numId="17" w16cid:durableId="243995791">
+    <w:abstractNumId w:val="15"/>
+  </w:num>
+  <w:num w:numId="18" w16cid:durableId="315651283">
+    <w:abstractNumId w:val="16"/>
+  </w:num>
+  <w:num w:numId="19" w16cid:durableId="738671826">
+    <w:abstractNumId w:val="5"/>
+  </w:num>
+  <w:num w:numId="20" w16cid:durableId="903873269">
+    <w:abstractNumId w:val="3"/>
+  </w:num>
+  <w:num w:numId="21" w16cid:durableId="732310368">
+    <w:abstractNumId w:val="26"/>
+  </w:num>
+  <w:num w:numId="22" w16cid:durableId="1020742265">
     <w:abstractNumId w:val="20"/>
   </w:num>
-  <w:num w:numId="2">
+  <w:num w:numId="23" w16cid:durableId="1078095353">
+    <w:abstractNumId w:val="13"/>
+  </w:num>
+  <w:num w:numId="24" w16cid:durableId="64303549">
+    <w:abstractNumId w:val="24"/>
+  </w:num>
+  <w:num w:numId="25" w16cid:durableId="1411461061">
     <w:abstractNumId w:val="17"/>
   </w:num>
-  <w:num w:numId="3">
-    <w:abstractNumId w:val="2"/>
-  </w:num>
-  <w:num w:numId="4">
-    <w:abstractNumId w:val="19"/>
-  </w:num>
-  <w:num w:numId="5">
-    <w:abstractNumId w:val="8"/>
-  </w:num>
-  <w:num w:numId="6">
-    <w:abstractNumId w:val="0"/>
-  </w:num>
-  <w:num w:numId="7">
-    <w:abstractNumId w:val="10"/>
-  </w:num>
-  <w:num w:numId="8">
-    <w:abstractNumId w:val="7"/>
-  </w:num>
-  <w:num w:numId="9">
-    <w:abstractNumId w:val="4"/>
-  </w:num>
-  <w:num w:numId="10">
-    <w:abstractNumId w:val="1"/>
-  </w:num>
-  <w:num w:numId="11">
-    <w:abstractNumId w:val="9"/>
-  </w:num>
-  <w:num w:numId="12">
-    <w:abstractNumId w:val="21"/>
-  </w:num>
-  <w:num w:numId="13">
-    <w:abstractNumId w:val="6"/>
-  </w:num>
-  <w:num w:numId="14">
-    <w:abstractNumId w:val="23"/>
-  </w:num>
-  <w:num w:numId="15">
-    <w:abstractNumId w:val="12"/>
-  </w:num>
-  <w:num w:numId="16">
-    <w:abstractNumId w:val="11"/>
-  </w:num>
-  <w:num w:numId="17">
+  <w:num w:numId="26" w16cid:durableId="471481783">
     <w:abstractNumId w:val="14"/>
   </w:num>
-  <w:num w:numId="18">
-    <w:abstractNumId w:val="15"/>
-  </w:num>
-  <w:num w:numId="19">
-    <w:abstractNumId w:val="5"/>
-  </w:num>
-  <w:num w:numId="20">
-    <w:abstractNumId w:val="3"/>
-  </w:num>
-  <w:num w:numId="21">
-    <w:abstractNumId w:val="24"/>
-  </w:num>
-  <w:num w:numId="22">
+  <w:num w:numId="27" w16cid:durableId="1581134528">
     <w:abstractNumId w:val="18"/>
-  </w:num>
-  <w:num w:numId="23">
-    <w:abstractNumId w:val="13"/>
-  </w:num>
-  <w:num w:numId="24">
-    <w:abstractNumId w:val="22"/>
-  </w:num>
-  <w:num w:numId="25">
-    <w:abstractNumId w:val="16"/>
   </w:num>
 </w:numbering>
 </file>
 
 <file path=word/styles.xml><?xml version="1.0" encoding="utf-8"?>
-<w:styles xmlns:r="http://schemas.openxmlformats.org/officeDocument/2006/relationships" xmlns:w="http://schemas.openxmlformats.org/wordprocessingml/2006/main">
+<w:styles xmlns:mc="http://schemas.openxmlformats.org/markup-compatibility/2006" xmlns:r="http://schemas.openxmlformats.org/officeDocument/2006/relationships" xmlns:w="http://schemas.openxmlformats.org/wordprocessingml/2006/main" xmlns:w14="http://schemas.microsoft.com/office/word/2010/wordml" xmlns:w15="http://schemas.microsoft.com/office/word/2012/wordml" xmlns:w16cex="http://schemas.microsoft.com/office/word/2018/wordml/cex" xmlns:w16cid="http://schemas.microsoft.com/office/word/2016/wordml/cid" xmlns:w16="http://schemas.microsoft.com/office/word/2018/wordml" xmlns:w16du="http://schemas.microsoft.com/office/word/2023/wordml/word16du" xmlns:w16sdtdh="http://schemas.microsoft.com/office/word/2020/wordml/sdtdatahash" xmlns:w16sdtfl="http://schemas.microsoft.com/office/word/2024/wordml/sdtformatlock" xmlns:w16se="http://schemas.microsoft.com/office/word/2015/wordml/symex" mc:Ignorable="w14 w15 w16se w16cid w16 w16cex w16sdtdh w16sdtfl w16du">
   <w:docDefaults>
     <w:rPrDefault>
       <w:rPr>
@@ -3507,146 +3855,385 @@
       </w:pPr>
     </w:pPrDefault>
   </w:docDefaults>
-  <w:latentStyles w:defLockedState="0" w:defUIPriority="99" w:defSemiHidden="1" w:defUnhideWhenUsed="1" w:defQFormat="0" w:count="267">
-    <w:lsdException w:name="Normal" w:semiHidden="0" w:uiPriority="0" w:unhideWhenUsed="0" w:qFormat="1"/>
-    <w:lsdException w:name="heading 1" w:semiHidden="0" w:uiPriority="9" w:unhideWhenUsed="0" w:qFormat="1"/>
-    <w:lsdException w:name="heading 2" w:uiPriority="9" w:qFormat="1"/>
-    <w:lsdException w:name="heading 3" w:uiPriority="9" w:qFormat="1"/>
-    <w:lsdException w:name="heading 4" w:uiPriority="9" w:qFormat="1"/>
-    <w:lsdException w:name="heading 5" w:uiPriority="9" w:qFormat="1"/>
-    <w:lsdException w:name="heading 6" w:uiPriority="9" w:qFormat="1"/>
-    <w:lsdException w:name="heading 7" w:uiPriority="9" w:qFormat="1"/>
-    <w:lsdException w:name="heading 8" w:uiPriority="9" w:qFormat="1"/>
-    <w:lsdException w:name="heading 9" w:uiPriority="9" w:qFormat="1"/>
-    <w:lsdException w:name="toc 1" w:uiPriority="39"/>
-    <w:lsdException w:name="toc 2" w:uiPriority="39"/>
-    <w:lsdException w:name="toc 3" w:uiPriority="39"/>
-    <w:lsdException w:name="toc 4" w:uiPriority="39"/>
-    <w:lsdException w:name="toc 5" w:uiPriority="39"/>
-    <w:lsdException w:name="toc 6" w:uiPriority="39"/>
-    <w:lsdException w:name="toc 7" w:uiPriority="39"/>
-    <w:lsdException w:name="toc 8" w:uiPriority="39"/>
-    <w:lsdException w:name="toc 9" w:uiPriority="39"/>
-    <w:lsdException w:name="caption" w:uiPriority="35" w:qFormat="1"/>
-    <w:lsdException w:name="Title" w:semiHidden="0" w:uiPriority="10" w:unhideWhenUsed="0" w:qFormat="1"/>
-    <w:lsdException w:name="Default Paragraph Font" w:uiPriority="1"/>
-    <w:lsdException w:name="Subtitle" w:semiHidden="0" w:uiPriority="11" w:unhideWhenUsed="0" w:qFormat="1"/>
-    <w:lsdException w:name="Strong" w:semiHidden="0" w:uiPriority="22" w:unhideWhenUsed="0" w:qFormat="1"/>
-    <w:lsdException w:name="Emphasis" w:semiHidden="0" w:uiPriority="20" w:unhideWhenUsed="0" w:qFormat="1"/>
-    <w:lsdException w:name="Table Grid" w:semiHidden="0" w:uiPriority="39" w:unhideWhenUsed="0"/>
-    <w:lsdException w:name="Placeholder Text" w:unhideWhenUsed="0"/>
-    <w:lsdException w:name="No Spacing" w:semiHidden="0" w:uiPriority="1" w:unhideWhenUsed="0" w:qFormat="1"/>
-    <w:lsdException w:name="Light Shading" w:semiHidden="0" w:uiPriority="60" w:unhideWhenUsed="0"/>
-    <w:lsdException w:name="Light List" w:semiHidden="0" w:uiPriority="61" w:unhideWhenUsed="0"/>
-    <w:lsdException w:name="Light Grid" w:semiHidden="0" w:uiPriority="62" w:unhideWhenUsed="0"/>
-    <w:lsdException w:name="Medium Shading 1" w:semiHidden="0" w:uiPriority="63" w:unhideWhenUsed="0"/>
-    <w:lsdException w:name="Medium Shading 2" w:semiHidden="0" w:uiPriority="64" w:unhideWhenUsed="0"/>
-    <w:lsdException w:name="Medium List 1" w:semiHidden="0" w:uiPriority="65" w:unhideWhenUsed="0"/>
-    <w:lsdException w:name="Medium List 2" w:semiHidden="0" w:uiPriority="66" w:unhideWhenUsed="0"/>
-    <w:lsdException w:name="Medium Grid 1" w:semiHidden="0" w:uiPriority="67" w:unhideWhenUsed="0"/>
-    <w:lsdException w:name="Medium Grid 2" w:semiHidden="0" w:uiPriority="68" w:unhideWhenUsed="0"/>
-    <w:lsdException w:name="Medium Grid 3" w:semiHidden="0" w:uiPriority="69" w:unhideWhenUsed="0"/>
-    <w:lsdException w:name="Dark List" w:semiHidden="0" w:uiPriority="70" w:unhideWhenUsed="0"/>
-    <w:lsdException w:name="Colorful Shading" w:semiHidden="0" w:uiPriority="71" w:unhideWhenUsed="0"/>
-    <w:lsdException w:name="Colorful List" w:semiHidden="0" w:uiPriority="72" w:unhideWhenUsed="0"/>
-    <w:lsdException w:name="Colorful Grid" w:semiHidden="0" w:uiPriority="73" w:unhideWhenUsed="0"/>
-    <w:lsdException w:name="Light Shading Accent 1" w:semiHidden="0" w:uiPriority="60" w:unhideWhenUsed="0"/>
-    <w:lsdException w:name="Light List Accent 1" w:semiHidden="0" w:uiPriority="61" w:unhideWhenUsed="0"/>
-    <w:lsdException w:name="Light Grid Accent 1" w:semiHidden="0" w:uiPriority="62" w:unhideWhenUsed="0"/>
-    <w:lsdException w:name="Medium Shading 1 Accent 1" w:semiHidden="0" w:uiPriority="63" w:unhideWhenUsed="0"/>
-    <w:lsdException w:name="Medium Shading 2 Accent 1" w:semiHidden="0" w:uiPriority="64" w:unhideWhenUsed="0"/>
-    <w:lsdException w:name="Medium List 1 Accent 1" w:semiHidden="0" w:uiPriority="65" w:unhideWhenUsed="0"/>
-    <w:lsdException w:name="Revision" w:unhideWhenUsed="0"/>
-    <w:lsdException w:name="List Paragraph" w:semiHidden="0" w:uiPriority="34" w:unhideWhenUsed="0" w:qFormat="1"/>
-    <w:lsdException w:name="Quote" w:semiHidden="0" w:uiPriority="29" w:unhideWhenUsed="0" w:qFormat="1"/>
-    <w:lsdException w:name="Intense Quote" w:semiHidden="0" w:uiPriority="30" w:unhideWhenUsed="0" w:qFormat="1"/>
-    <w:lsdException w:name="Medium List 2 Accent 1" w:semiHidden="0" w:uiPriority="66" w:unhideWhenUsed="0"/>
-    <w:lsdException w:name="Medium Grid 1 Accent 1" w:semiHidden="0" w:uiPriority="67" w:unhideWhenUsed="0"/>
-    <w:lsdException w:name="Medium Grid 2 Accent 1" w:semiHidden="0" w:uiPriority="68" w:unhideWhenUsed="0"/>
-    <w:lsdException w:name="Medium Grid 3 Accent 1" w:semiHidden="0" w:uiPriority="69" w:unhideWhenUsed="0"/>
-    <w:lsdException w:name="Dark List Accent 1" w:semiHidden="0" w:uiPriority="70" w:unhideWhenUsed="0"/>
-    <w:lsdException w:name="Colorful Shading Accent 1" w:semiHidden="0" w:uiPriority="71" w:unhideWhenUsed="0"/>
-    <w:lsdException w:name="Colorful List Accent 1" w:semiHidden="0" w:uiPriority="72" w:unhideWhenUsed="0"/>
-    <w:lsdException w:name="Colorful Grid Accent 1" w:semiHidden="0" w:uiPriority="73" w:unhideWhenUsed="0"/>
-    <w:lsdException w:name="Light Shading Accent 2" w:semiHidden="0" w:uiPriority="60" w:unhideWhenUsed="0"/>
-    <w:lsdException w:name="Light List Accent 2" w:semiHidden="0" w:uiPriority="61" w:unhideWhenUsed="0"/>
-    <w:lsdException w:name="Light Grid Accent 2" w:semiHidden="0" w:uiPriority="62" w:unhideWhenUsed="0"/>
-    <w:lsdException w:name="Medium Shading 1 Accent 2" w:semiHidden="0" w:uiPriority="63" w:unhideWhenUsed="0"/>
-    <w:lsdException w:name="Medium Shading 2 Accent 2" w:semiHidden="0" w:uiPriority="64" w:unhideWhenUsed="0"/>
-    <w:lsdException w:name="Medium List 1 Accent 2" w:semiHidden="0" w:uiPriority="65" w:unhideWhenUsed="0"/>
-    <w:lsdException w:name="Medium List 2 Accent 2" w:semiHidden="0" w:uiPriority="66" w:unhideWhenUsed="0"/>
-    <w:lsdException w:name="Medium Grid 1 Accent 2" w:semiHidden="0" w:uiPriority="67" w:unhideWhenUsed="0"/>
-    <w:lsdException w:name="Medium Grid 2 Accent 2" w:semiHidden="0" w:uiPriority="68" w:unhideWhenUsed="0"/>
-    <w:lsdException w:name="Medium Grid 3 Accent 2" w:semiHidden="0" w:uiPriority="69" w:unhideWhenUsed="0"/>
-    <w:lsdException w:name="Dark List Accent 2" w:semiHidden="0" w:uiPriority="70" w:unhideWhenUsed="0"/>
-    <w:lsdException w:name="Colorful Shading Accent 2" w:semiHidden="0" w:uiPriority="71" w:unhideWhenUsed="0"/>
-    <w:lsdException w:name="Colorful List Accent 2" w:semiHidden="0" w:uiPriority="72" w:unhideWhenUsed="0"/>
-    <w:lsdException w:name="Colorful Grid Accent 2" w:semiHidden="0" w:uiPriority="73" w:unhideWhenUsed="0"/>
-    <w:lsdException w:name="Light Shading Accent 3" w:semiHidden="0" w:uiPriority="60" w:unhideWhenUsed="0"/>
-    <w:lsdException w:name="Light List Accent 3" w:semiHidden="0" w:uiPriority="61" w:unhideWhenUsed="0"/>
-    <w:lsdException w:name="Light Grid Accent 3" w:semiHidden="0" w:uiPriority="62" w:unhideWhenUsed="0"/>
-    <w:lsdException w:name="Medium Shading 1 Accent 3" w:semiHidden="0" w:uiPriority="63" w:unhideWhenUsed="0"/>
-    <w:lsdException w:name="Medium Shading 2 Accent 3" w:semiHidden="0" w:uiPriority="64" w:unhideWhenUsed="0"/>
-    <w:lsdException w:name="Medium List 1 Accent 3" w:semiHidden="0" w:uiPriority="65" w:unhideWhenUsed="0"/>
-    <w:lsdException w:name="Medium List 2 Accent 3" w:semiHidden="0" w:uiPriority="66" w:unhideWhenUsed="0"/>
-    <w:lsdException w:name="Medium Grid 1 Accent 3" w:semiHidden="0" w:uiPriority="67" w:unhideWhenUsed="0"/>
-    <w:lsdException w:name="Medium Grid 2 Accent 3" w:semiHidden="0" w:uiPriority="68" w:unhideWhenUsed="0"/>
-    <w:lsdException w:name="Medium Grid 3 Accent 3" w:semiHidden="0" w:uiPriority="69" w:unhideWhenUsed="0"/>
-    <w:lsdException w:name="Dark List Accent 3" w:semiHidden="0" w:uiPriority="70" w:unhideWhenUsed="0"/>
-    <w:lsdException w:name="Colorful Shading Accent 3" w:semiHidden="0" w:uiPriority="71" w:unhideWhenUsed="0"/>
-    <w:lsdException w:name="Colorful List Accent 3" w:semiHidden="0" w:uiPriority="72" w:unhideWhenUsed="0"/>
-    <w:lsdException w:name="Colorful Grid Accent 3" w:semiHidden="0" w:uiPriority="73" w:unhideWhenUsed="0"/>
-    <w:lsdException w:name="Light Shading Accent 4" w:semiHidden="0" w:uiPriority="60" w:unhideWhenUsed="0"/>
-    <w:lsdException w:name="Light List Accent 4" w:semiHidden="0" w:uiPriority="61" w:unhideWhenUsed="0"/>
-    <w:lsdException w:name="Light Grid Accent 4" w:semiHidden="0" w:uiPriority="62" w:unhideWhenUsed="0"/>
-    <w:lsdException w:name="Medium Shading 1 Accent 4" w:semiHidden="0" w:uiPriority="63" w:unhideWhenUsed="0"/>
-    <w:lsdException w:name="Medium Shading 2 Accent 4" w:semiHidden="0" w:uiPriority="64" w:unhideWhenUsed="0"/>
-    <w:lsdException w:name="Medium List 1 Accent 4" w:semiHidden="0" w:uiPriority="65" w:unhideWhenUsed="0"/>
-    <w:lsdException w:name="Medium List 2 Accent 4" w:semiHidden="0" w:uiPriority="66" w:unhideWhenUsed="0"/>
-    <w:lsdException w:name="Medium Grid 1 Accent 4" w:semiHidden="0" w:uiPriority="67" w:unhideWhenUsed="0"/>
-    <w:lsdException w:name="Medium Grid 2 Accent 4" w:semiHidden="0" w:uiPriority="68" w:unhideWhenUsed="0"/>
-    <w:lsdException w:name="Medium Grid 3 Accent 4" w:semiHidden="0" w:uiPriority="69" w:unhideWhenUsed="0"/>
-    <w:lsdException w:name="Dark List Accent 4" w:semiHidden="0" w:uiPriority="70" w:unhideWhenUsed="0"/>
-    <w:lsdException w:name="Colorful Shading Accent 4" w:semiHidden="0" w:uiPriority="71" w:unhideWhenUsed="0"/>
-    <w:lsdException w:name="Colorful List Accent 4" w:semiHidden="0" w:uiPriority="72" w:unhideWhenUsed="0"/>
-    <w:lsdException w:name="Colorful Grid Accent 4" w:semiHidden="0" w:uiPriority="73" w:unhideWhenUsed="0"/>
-    <w:lsdException w:name="Light Shading Accent 5" w:semiHidden="0" w:uiPriority="60" w:unhideWhenUsed="0"/>
-    <w:lsdException w:name="Light List Accent 5" w:semiHidden="0" w:uiPriority="61" w:unhideWhenUsed="0"/>
-    <w:lsdException w:name="Light Grid Accent 5" w:semiHidden="0" w:uiPriority="62" w:unhideWhenUsed="0"/>
-    <w:lsdException w:name="Medium Shading 1 Accent 5" w:semiHidden="0" w:uiPriority="63" w:unhideWhenUsed="0"/>
-    <w:lsdException w:name="Medium Shading 2 Accent 5" w:semiHidden="0" w:uiPriority="64" w:unhideWhenUsed="0"/>
-    <w:lsdException w:name="Medium List 1 Accent 5" w:semiHidden="0" w:uiPriority="65" w:unhideWhenUsed="0"/>
-    <w:lsdException w:name="Medium List 2 Accent 5" w:semiHidden="0" w:uiPriority="66" w:unhideWhenUsed="0"/>
-    <w:lsdException w:name="Medium Grid 1 Accent 5" w:semiHidden="0" w:uiPriority="67" w:unhideWhenUsed="0"/>
-    <w:lsdException w:name="Medium Grid 2 Accent 5" w:semiHidden="0" w:uiPriority="68" w:unhideWhenUsed="0"/>
-    <w:lsdException w:name="Medium Grid 3 Accent 5" w:semiHidden="0" w:uiPriority="69" w:unhideWhenUsed="0"/>
-    <w:lsdException w:name="Dark List Accent 5" w:semiHidden="0" w:uiPriority="70" w:unhideWhenUsed="0"/>
-    <w:lsdException w:name="Colorful Shading Accent 5" w:semiHidden="0" w:uiPriority="71" w:unhideWhenUsed="0"/>
-    <w:lsdException w:name="Colorful List Accent 5" w:semiHidden="0" w:uiPriority="72" w:unhideWhenUsed="0"/>
-    <w:lsdException w:name="Colorful Grid Accent 5" w:semiHidden="0" w:uiPriority="73" w:unhideWhenUsed="0"/>
-    <w:lsdException w:name="Light Shading Accent 6" w:semiHidden="0" w:uiPriority="60" w:unhideWhenUsed="0"/>
-    <w:lsdException w:name="Light List Accent 6" w:semiHidden="0" w:uiPriority="61" w:unhideWhenUsed="0"/>
-    <w:lsdException w:name="Light Grid Accent 6" w:semiHidden="0" w:uiPriority="62" w:unhideWhenUsed="0"/>
-    <w:lsdException w:name="Medium Shading 1 Accent 6" w:semiHidden="0" w:uiPriority="63" w:unhideWhenUsed="0"/>
-    <w:lsdException w:name="Medium Shading 2 Accent 6" w:semiHidden="0" w:uiPriority="64" w:unhideWhenUsed="0"/>
-    <w:lsdException w:name="Medium List 1 Accent 6" w:semiHidden="0" w:uiPriority="65" w:unhideWhenUsed="0"/>
-    <w:lsdException w:name="Medium List 2 Accent 6" w:semiHidden="0" w:uiPriority="66" w:unhideWhenUsed="0"/>
-    <w:lsdException w:name="Medium Grid 1 Accent 6" w:semiHidden="0" w:uiPriority="67" w:unhideWhenUsed="0"/>
-    <w:lsdException w:name="Medium Grid 2 Accent 6" w:semiHidden="0" w:uiPriority="68" w:unhideWhenUsed="0"/>
-    <w:lsdException w:name="Medium Grid 3 Accent 6" w:semiHidden="0" w:uiPriority="69" w:unhideWhenUsed="0"/>
-    <w:lsdException w:name="Dark List Accent 6" w:semiHidden="0" w:uiPriority="70" w:unhideWhenUsed="0"/>
-    <w:lsdException w:name="Colorful Shading Accent 6" w:semiHidden="0" w:uiPriority="71" w:unhideWhenUsed="0"/>
-    <w:lsdException w:name="Colorful List Accent 6" w:semiHidden="0" w:uiPriority="72" w:unhideWhenUsed="0"/>
-    <w:lsdException w:name="Colorful Grid Accent 6" w:semiHidden="0" w:uiPriority="73" w:unhideWhenUsed="0"/>
-    <w:lsdException w:name="Subtle Emphasis" w:semiHidden="0" w:uiPriority="19" w:unhideWhenUsed="0" w:qFormat="1"/>
-    <w:lsdException w:name="Intense Emphasis" w:semiHidden="0" w:uiPriority="21" w:unhideWhenUsed="0" w:qFormat="1"/>
-    <w:lsdException w:name="Subtle Reference" w:semiHidden="0" w:uiPriority="31" w:unhideWhenUsed="0" w:qFormat="1"/>
-    <w:lsdException w:name="Intense Reference" w:semiHidden="0" w:uiPriority="32" w:unhideWhenUsed="0" w:qFormat="1"/>
-    <w:lsdException w:name="Book Title" w:semiHidden="0" w:uiPriority="33" w:unhideWhenUsed="0" w:qFormat="1"/>
-    <w:lsdException w:name="Bibliography" w:uiPriority="37"/>
-    <w:lsdException w:name="TOC Heading" w:uiPriority="39" w:qFormat="1"/>
+  <w:latentStyles w:defLockedState="0" w:defUIPriority="99" w:defSemiHidden="0" w:defUnhideWhenUsed="0" w:defQFormat="0" w:count="376">
+    <w:lsdException w:name="Normal" w:uiPriority="0" w:qFormat="1"/>
+    <w:lsdException w:name="heading 1" w:uiPriority="9" w:qFormat="1"/>
+    <w:lsdException w:name="heading 2" w:semiHidden="1" w:uiPriority="9" w:unhideWhenUsed="1" w:qFormat="1"/>
+    <w:lsdException w:name="heading 3" w:semiHidden="1" w:uiPriority="9" w:unhideWhenUsed="1" w:qFormat="1"/>
+    <w:lsdException w:name="heading 4" w:semiHidden="1" w:uiPriority="9" w:unhideWhenUsed="1" w:qFormat="1"/>
+    <w:lsdException w:name="heading 5" w:semiHidden="1" w:uiPriority="9" w:unhideWhenUsed="1" w:qFormat="1"/>
+    <w:lsdException w:name="heading 6" w:semiHidden="1" w:uiPriority="9" w:unhideWhenUsed="1" w:qFormat="1"/>
+    <w:lsdException w:name="heading 7" w:semiHidden="1" w:uiPriority="9" w:unhideWhenUsed="1" w:qFormat="1"/>
+    <w:lsdException w:name="heading 8" w:semiHidden="1" w:uiPriority="9" w:unhideWhenUsed="1" w:qFormat="1"/>
+    <w:lsdException w:name="heading 9" w:semiHidden="1" w:uiPriority="9" w:unhideWhenUsed="1" w:qFormat="1"/>
+    <w:lsdException w:name="index 1" w:semiHidden="1" w:unhideWhenUsed="1"/>
+    <w:lsdException w:name="index 2" w:semiHidden="1" w:unhideWhenUsed="1"/>
+    <w:lsdException w:name="index 3" w:semiHidden="1" w:unhideWhenUsed="1"/>
+    <w:lsdException w:name="index 4" w:semiHidden="1" w:unhideWhenUsed="1"/>
+    <w:lsdException w:name="index 5" w:semiHidden="1" w:unhideWhenUsed="1"/>
+    <w:lsdException w:name="index 6" w:semiHidden="1" w:unhideWhenUsed="1"/>
+    <w:lsdException w:name="index 7" w:semiHidden="1" w:unhideWhenUsed="1"/>
+    <w:lsdException w:name="index 8" w:semiHidden="1" w:unhideWhenUsed="1"/>
+    <w:lsdException w:name="index 9" w:semiHidden="1" w:unhideWhenUsed="1"/>
+    <w:lsdException w:name="toc 1" w:semiHidden="1" w:uiPriority="39" w:unhideWhenUsed="1"/>
+    <w:lsdException w:name="toc 2" w:semiHidden="1" w:uiPriority="39" w:unhideWhenUsed="1"/>
+    <w:lsdException w:name="toc 3" w:semiHidden="1" w:uiPriority="39" w:unhideWhenUsed="1"/>
+    <w:lsdException w:name="toc 4" w:semiHidden="1" w:uiPriority="39" w:unhideWhenUsed="1"/>
+    <w:lsdException w:name="toc 5" w:semiHidden="1" w:uiPriority="39" w:unhideWhenUsed="1"/>
+    <w:lsdException w:name="toc 6" w:semiHidden="1" w:uiPriority="39" w:unhideWhenUsed="1"/>
+    <w:lsdException w:name="toc 7" w:semiHidden="1" w:uiPriority="39" w:unhideWhenUsed="1"/>
+    <w:lsdException w:name="toc 8" w:semiHidden="1" w:uiPriority="39" w:unhideWhenUsed="1"/>
+    <w:lsdException w:name="toc 9" w:semiHidden="1" w:uiPriority="39" w:unhideWhenUsed="1"/>
+    <w:lsdException w:name="Normal Indent" w:semiHidden="1" w:unhideWhenUsed="1"/>
+    <w:lsdException w:name="footnote text" w:semiHidden="1" w:unhideWhenUsed="1"/>
+    <w:lsdException w:name="annotation text" w:semiHidden="1" w:unhideWhenUsed="1"/>
+    <w:lsdException w:name="header" w:semiHidden="1" w:unhideWhenUsed="1"/>
+    <w:lsdException w:name="footer" w:semiHidden="1" w:unhideWhenUsed="1"/>
+    <w:lsdException w:name="index heading" w:semiHidden="1" w:unhideWhenUsed="1"/>
+    <w:lsdException w:name="caption" w:semiHidden="1" w:uiPriority="35" w:unhideWhenUsed="1" w:qFormat="1"/>
+    <w:lsdException w:name="table of figures" w:semiHidden="1" w:unhideWhenUsed="1"/>
+    <w:lsdException w:name="envelope address" w:semiHidden="1" w:unhideWhenUsed="1"/>
+    <w:lsdException w:name="envelope return" w:semiHidden="1" w:unhideWhenUsed="1"/>
+    <w:lsdException w:name="footnote reference" w:semiHidden="1" w:unhideWhenUsed="1"/>
+    <w:lsdException w:name="annotation reference" w:semiHidden="1" w:unhideWhenUsed="1"/>
+    <w:lsdException w:name="line number" w:semiHidden="1" w:unhideWhenUsed="1"/>
+    <w:lsdException w:name="page number" w:semiHidden="1" w:unhideWhenUsed="1"/>
+    <w:lsdException w:name="endnote reference" w:semiHidden="1" w:unhideWhenUsed="1"/>
+    <w:lsdException w:name="endnote text" w:semiHidden="1" w:unhideWhenUsed="1"/>
+    <w:lsdException w:name="table of authorities" w:semiHidden="1" w:unhideWhenUsed="1"/>
+    <w:lsdException w:name="macro" w:semiHidden="1" w:unhideWhenUsed="1"/>
+    <w:lsdException w:name="toa heading" w:semiHidden="1" w:unhideWhenUsed="1"/>
+    <w:lsdException w:name="List" w:semiHidden="1" w:unhideWhenUsed="1"/>
+    <w:lsdException w:name="List Bullet" w:semiHidden="1" w:unhideWhenUsed="1"/>
+    <w:lsdException w:name="List Number" w:semiHidden="1" w:unhideWhenUsed="1"/>
+    <w:lsdException w:name="List 2" w:semiHidden="1" w:unhideWhenUsed="1"/>
+    <w:lsdException w:name="List 3" w:semiHidden="1" w:unhideWhenUsed="1"/>
+    <w:lsdException w:name="List 4" w:semiHidden="1" w:unhideWhenUsed="1"/>
+    <w:lsdException w:name="List 5" w:semiHidden="1" w:unhideWhenUsed="1"/>
+    <w:lsdException w:name="List Bullet 2" w:semiHidden="1" w:unhideWhenUsed="1"/>
+    <w:lsdException w:name="List Bullet 3" w:semiHidden="1" w:unhideWhenUsed="1"/>
+    <w:lsdException w:name="List Bullet 4" w:semiHidden="1" w:unhideWhenUsed="1"/>
+    <w:lsdException w:name="List Bullet 5" w:semiHidden="1" w:unhideWhenUsed="1"/>
+    <w:lsdException w:name="List Number 2" w:semiHidden="1" w:unhideWhenUsed="1"/>
+    <w:lsdException w:name="List Number 3" w:semiHidden="1" w:unhideWhenUsed="1"/>
+    <w:lsdException w:name="List Number 4" w:semiHidden="1" w:unhideWhenUsed="1"/>
+    <w:lsdException w:name="List Number 5" w:semiHidden="1" w:unhideWhenUsed="1"/>
+    <w:lsdException w:name="Title" w:uiPriority="10" w:qFormat="1"/>
+    <w:lsdException w:name="Closing" w:semiHidden="1" w:unhideWhenUsed="1"/>
+    <w:lsdException w:name="Signature" w:semiHidden="1" w:unhideWhenUsed="1"/>
+    <w:lsdException w:name="Default Paragraph Font" w:semiHidden="1" w:uiPriority="1" w:unhideWhenUsed="1"/>
+    <w:lsdException w:name="Body Text" w:semiHidden="1" w:unhideWhenUsed="1"/>
+    <w:lsdException w:name="Body Text Indent" w:semiHidden="1" w:unhideWhenUsed="1"/>
+    <w:lsdException w:name="List Continue" w:semiHidden="1" w:unhideWhenUsed="1"/>
+    <w:lsdException w:name="List Continue 2" w:semiHidden="1" w:unhideWhenUsed="1"/>
+    <w:lsdException w:name="List Continue 3" w:semiHidden="1" w:unhideWhenUsed="1"/>
+    <w:lsdException w:name="List Continue 4" w:semiHidden="1" w:unhideWhenUsed="1"/>
+    <w:lsdException w:name="List Continue 5" w:semiHidden="1" w:unhideWhenUsed="1"/>
+    <w:lsdException w:name="Message Header" w:semiHidden="1" w:unhideWhenUsed="1"/>
+    <w:lsdException w:name="Subtitle" w:uiPriority="11" w:qFormat="1"/>
+    <w:lsdException w:name="Salutation" w:semiHidden="1" w:unhideWhenUsed="1"/>
+    <w:lsdException w:name="Date" w:semiHidden="1" w:unhideWhenUsed="1"/>
+    <w:lsdException w:name="Body Text First Indent" w:semiHidden="1" w:unhideWhenUsed="1"/>
+    <w:lsdException w:name="Body Text First Indent 2" w:semiHidden="1" w:unhideWhenUsed="1"/>
+    <w:lsdException w:name="Note Heading" w:semiHidden="1" w:unhideWhenUsed="1"/>
+    <w:lsdException w:name="Body Text 2" w:semiHidden="1" w:unhideWhenUsed="1"/>
+    <w:lsdException w:name="Body Text 3" w:semiHidden="1" w:unhideWhenUsed="1"/>
+    <w:lsdException w:name="Body Text Indent 2" w:semiHidden="1" w:unhideWhenUsed="1"/>
+    <w:lsdException w:name="Body Text Indent 3" w:semiHidden="1" w:unhideWhenUsed="1"/>
+    <w:lsdException w:name="Block Text" w:semiHidden="1" w:unhideWhenUsed="1"/>
+    <w:lsdException w:name="Hyperlink" w:semiHidden="1" w:unhideWhenUsed="1"/>
+    <w:lsdException w:name="FollowedHyperlink" w:semiHidden="1" w:unhideWhenUsed="1"/>
+    <w:lsdException w:name="Strong" w:uiPriority="22" w:qFormat="1"/>
+    <w:lsdException w:name="Emphasis" w:uiPriority="20" w:qFormat="1"/>
+    <w:lsdException w:name="Document Map" w:semiHidden="1" w:unhideWhenUsed="1"/>
+    <w:lsdException w:name="Plain Text" w:semiHidden="1" w:unhideWhenUsed="1"/>
+    <w:lsdException w:name="E-mail Signature" w:semiHidden="1" w:unhideWhenUsed="1"/>
+    <w:lsdException w:name="HTML Top of Form" w:semiHidden="1" w:unhideWhenUsed="1"/>
+    <w:lsdException w:name="HTML Bottom of Form" w:semiHidden="1" w:unhideWhenUsed="1"/>
+    <w:lsdException w:name="Normal (Web)" w:semiHidden="1" w:unhideWhenUsed="1"/>
+    <w:lsdException w:name="HTML Acronym" w:semiHidden="1" w:unhideWhenUsed="1"/>
+    <w:lsdException w:name="HTML Address" w:semiHidden="1" w:unhideWhenUsed="1"/>
+    <w:lsdException w:name="HTML Cite" w:semiHidden="1" w:unhideWhenUsed="1"/>
+    <w:lsdException w:name="HTML Code" w:semiHidden="1" w:unhideWhenUsed="1"/>
+    <w:lsdException w:name="HTML Definition" w:semiHidden="1" w:unhideWhenUsed="1"/>
+    <w:lsdException w:name="HTML Keyboard" w:semiHidden="1" w:unhideWhenUsed="1"/>
+    <w:lsdException w:name="HTML Preformatted" w:semiHidden="1" w:unhideWhenUsed="1"/>
+    <w:lsdException w:name="HTML Sample" w:semiHidden="1" w:unhideWhenUsed="1"/>
+    <w:lsdException w:name="HTML Typewriter" w:semiHidden="1" w:unhideWhenUsed="1"/>
+    <w:lsdException w:name="HTML Variable" w:semiHidden="1" w:unhideWhenUsed="1"/>
+    <w:lsdException w:name="Normal Table" w:semiHidden="1" w:unhideWhenUsed="1"/>
+    <w:lsdException w:name="annotation subject" w:semiHidden="1" w:unhideWhenUsed="1"/>
+    <w:lsdException w:name="No List" w:semiHidden="1" w:unhideWhenUsed="1"/>
+    <w:lsdException w:name="Outline List 1" w:semiHidden="1" w:unhideWhenUsed="1"/>
+    <w:lsdException w:name="Outline List 2" w:semiHidden="1" w:unhideWhenUsed="1"/>
+    <w:lsdException w:name="Outline List 3" w:semiHidden="1" w:unhideWhenUsed="1"/>
+    <w:lsdException w:name="Table Simple 1" w:semiHidden="1" w:unhideWhenUsed="1"/>
+    <w:lsdException w:name="Table Simple 2" w:semiHidden="1" w:unhideWhenUsed="1"/>
+    <w:lsdException w:name="Table Simple 3" w:semiHidden="1" w:unhideWhenUsed="1"/>
+    <w:lsdException w:name="Table Classic 1" w:semiHidden="1" w:unhideWhenUsed="1"/>
+    <w:lsdException w:name="Table Classic 2" w:semiHidden="1" w:unhideWhenUsed="1"/>
+    <w:lsdException w:name="Table Classic 3" w:semiHidden="1" w:unhideWhenUsed="1"/>
+    <w:lsdException w:name="Table Classic 4" w:semiHidden="1" w:unhideWhenUsed="1"/>
+    <w:lsdException w:name="Table Colorful 1" w:semiHidden="1" w:unhideWhenUsed="1"/>
+    <w:lsdException w:name="Table Colorful 2" w:semiHidden="1" w:unhideWhenUsed="1"/>
+    <w:lsdException w:name="Table Colorful 3" w:semiHidden="1" w:unhideWhenUsed="1"/>
+    <w:lsdException w:name="Table Columns 1" w:semiHidden="1" w:unhideWhenUsed="1"/>
+    <w:lsdException w:name="Table Columns 2" w:semiHidden="1" w:unhideWhenUsed="1"/>
+    <w:lsdException w:name="Table Columns 3" w:semiHidden="1" w:unhideWhenUsed="1"/>
+    <w:lsdException w:name="Table Columns 4" w:semiHidden="1" w:unhideWhenUsed="1"/>
+    <w:lsdException w:name="Table Columns 5" w:semiHidden="1" w:unhideWhenUsed="1"/>
+    <w:lsdException w:name="Table Grid 1" w:semiHidden="1" w:unhideWhenUsed="1"/>
+    <w:lsdException w:name="Table Grid 2" w:semiHidden="1" w:unhideWhenUsed="1"/>
+    <w:lsdException w:name="Table Grid 3" w:semiHidden="1" w:unhideWhenUsed="1"/>
+    <w:lsdException w:name="Table Grid 4" w:semiHidden="1" w:unhideWhenUsed="1"/>
+    <w:lsdException w:name="Table Grid 5" w:semiHidden="1" w:unhideWhenUsed="1"/>
+    <w:lsdException w:name="Table Grid 6" w:semiHidden="1" w:unhideWhenUsed="1"/>
+    <w:lsdException w:name="Table Grid 7" w:semiHidden="1" w:unhideWhenUsed="1"/>
+    <w:lsdException w:name="Table Grid 8" w:semiHidden="1" w:unhideWhenUsed="1"/>
+    <w:lsdException w:name="Table List 1" w:semiHidden="1" w:unhideWhenUsed="1"/>
+    <w:lsdException w:name="Table List 2" w:semiHidden="1" w:unhideWhenUsed="1"/>
+    <w:lsdException w:name="Table List 3" w:semiHidden="1" w:unhideWhenUsed="1"/>
+    <w:lsdException w:name="Table List 4" w:semiHidden="1" w:unhideWhenUsed="1"/>
+    <w:lsdException w:name="Table List 5" w:semiHidden="1" w:unhideWhenUsed="1"/>
+    <w:lsdException w:name="Table List 6" w:semiHidden="1" w:unhideWhenUsed="1"/>
+    <w:lsdException w:name="Table List 7" w:semiHidden="1" w:unhideWhenUsed="1"/>
+    <w:lsdException w:name="Table List 8" w:semiHidden="1" w:unhideWhenUsed="1"/>
+    <w:lsdException w:name="Table 3D effects 1" w:semiHidden="1" w:unhideWhenUsed="1"/>
+    <w:lsdException w:name="Table 3D effects 2" w:semiHidden="1" w:unhideWhenUsed="1"/>
+    <w:lsdException w:name="Table 3D effects 3" w:semiHidden="1" w:unhideWhenUsed="1"/>
+    <w:lsdException w:name="Table Contemporary" w:semiHidden="1" w:unhideWhenUsed="1"/>
+    <w:lsdException w:name="Table Elegant" w:semiHidden="1" w:unhideWhenUsed="1"/>
+    <w:lsdException w:name="Table Professional" w:semiHidden="1" w:unhideWhenUsed="1"/>
+    <w:lsdException w:name="Table Subtle 1" w:semiHidden="1" w:unhideWhenUsed="1"/>
+    <w:lsdException w:name="Table Subtle 2" w:semiHidden="1" w:unhideWhenUsed="1"/>
+    <w:lsdException w:name="Table Web 1" w:semiHidden="1" w:unhideWhenUsed="1"/>
+    <w:lsdException w:name="Table Web 2" w:semiHidden="1" w:unhideWhenUsed="1"/>
+    <w:lsdException w:name="Table Web 3" w:semiHidden="1" w:unhideWhenUsed="1"/>
+    <w:lsdException w:name="Balloon Text" w:semiHidden="1" w:unhideWhenUsed="1"/>
+    <w:lsdException w:name="Table Grid" w:uiPriority="39"/>
+    <w:lsdException w:name="Table Theme" w:semiHidden="1" w:unhideWhenUsed="1"/>
+    <w:lsdException w:name="Placeholder Text" w:semiHidden="1"/>
+    <w:lsdException w:name="No Spacing" w:uiPriority="1" w:qFormat="1"/>
+    <w:lsdException w:name="Light Shading" w:uiPriority="60"/>
+    <w:lsdException w:name="Light List" w:uiPriority="61"/>
+    <w:lsdException w:name="Light Grid" w:uiPriority="62"/>
+    <w:lsdException w:name="Medium Shading 1" w:uiPriority="63"/>
+    <w:lsdException w:name="Medium Shading 2" w:uiPriority="64"/>
+    <w:lsdException w:name="Medium List 1" w:uiPriority="65"/>
+    <w:lsdException w:name="Medium List 2" w:uiPriority="66"/>
+    <w:lsdException w:name="Medium Grid 1" w:uiPriority="67"/>
+    <w:lsdException w:name="Medium Grid 2" w:uiPriority="68"/>
+    <w:lsdException w:name="Medium Grid 3" w:uiPriority="69"/>
+    <w:lsdException w:name="Dark List" w:uiPriority="70"/>
+    <w:lsdException w:name="Colorful Shading" w:uiPriority="71"/>
+    <w:lsdException w:name="Colorful List" w:uiPriority="72"/>
+    <w:lsdException w:name="Colorful Grid" w:uiPriority="73"/>
+    <w:lsdException w:name="Light Shading Accent 1" w:uiPriority="60"/>
+    <w:lsdException w:name="Light List Accent 1" w:uiPriority="61"/>
+    <w:lsdException w:name="Light Grid Accent 1" w:uiPriority="62"/>
+    <w:lsdException w:name="Medium Shading 1 Accent 1" w:uiPriority="63"/>
+    <w:lsdException w:name="Medium Shading 2 Accent 1" w:uiPriority="64"/>
+    <w:lsdException w:name="Medium List 1 Accent 1" w:uiPriority="65"/>
+    <w:lsdException w:name="Revision" w:semiHidden="1"/>
+    <w:lsdException w:name="List Paragraph" w:uiPriority="34" w:qFormat="1"/>
+    <w:lsdException w:name="Quote" w:uiPriority="29" w:qFormat="1"/>
+    <w:lsdException w:name="Intense Quote" w:uiPriority="30" w:qFormat="1"/>
+    <w:lsdException w:name="Medium List 2 Accent 1" w:uiPriority="66"/>
+    <w:lsdException w:name="Medium Grid 1 Accent 1" w:uiPriority="67"/>
+    <w:lsdException w:name="Medium Grid 2 Accent 1" w:uiPriority="68"/>
+    <w:lsdException w:name="Medium Grid 3 Accent 1" w:uiPriority="69"/>
+    <w:lsdException w:name="Dark List Accent 1" w:uiPriority="70"/>
+    <w:lsdException w:name="Colorful Shading Accent 1" w:uiPriority="71"/>
+    <w:lsdException w:name="Colorful List Accent 1" w:uiPriority="72"/>
+    <w:lsdException w:name="Colorful Grid Accent 1" w:uiPriority="73"/>
+    <w:lsdException w:name="Light Shading Accent 2" w:uiPriority="60"/>
+    <w:lsdException w:name="Light List Accent 2" w:uiPriority="61"/>
+    <w:lsdException w:name="Light Grid Accent 2" w:uiPriority="62"/>
+    <w:lsdException w:name="Medium Shading 1 Accent 2" w:uiPriority="63"/>
+    <w:lsdException w:name="Medium Shading 2 Accent 2" w:uiPriority="64"/>
+    <w:lsdException w:name="Medium List 1 Accent 2" w:uiPriority="65"/>
+    <w:lsdException w:name="Medium List 2 Accent 2" w:uiPriority="66"/>
+    <w:lsdException w:name="Medium Grid 1 Accent 2" w:uiPriority="67"/>
+    <w:lsdException w:name="Medium Grid 2 Accent 2" w:uiPriority="68"/>
+    <w:lsdException w:name="Medium Grid 3 Accent 2" w:uiPriority="69"/>
+    <w:lsdException w:name="Dark List Accent 2" w:uiPriority="70"/>
+    <w:lsdException w:name="Colorful Shading Accent 2" w:uiPriority="71"/>
+    <w:lsdException w:name="Colorful List Accent 2" w:uiPriority="72"/>
+    <w:lsdException w:name="Colorful Grid Accent 2" w:uiPriority="73"/>
+    <w:lsdException w:name="Light Shading Accent 3" w:uiPriority="60"/>
+    <w:lsdException w:name="Light List Accent 3" w:uiPriority="61"/>
+    <w:lsdException w:name="Light Grid Accent 3" w:uiPriority="62"/>
+    <w:lsdException w:name="Medium Shading 1 Accent 3" w:uiPriority="63"/>
+    <w:lsdException w:name="Medium Shading 2 Accent 3" w:uiPriority="64"/>
+    <w:lsdException w:name="Medium List 1 Accent 3" w:uiPriority="65"/>
+    <w:lsdException w:name="Medium List 2 Accent 3" w:uiPriority="66"/>
+    <w:lsdException w:name="Medium Grid 1 Accent 3" w:uiPriority="67"/>
+    <w:lsdException w:name="Medium Grid 2 Accent 3" w:uiPriority="68"/>
+    <w:lsdException w:name="Medium Grid 3 Accent 3" w:uiPriority="69"/>
+    <w:lsdException w:name="Dark List Accent 3" w:uiPriority="70"/>
+    <w:lsdException w:name="Colorful Shading Accent 3" w:uiPriority="71"/>
+    <w:lsdException w:name="Colorful List Accent 3" w:uiPriority="72"/>
+    <w:lsdException w:name="Colorful Grid Accent 3" w:uiPriority="73"/>
+    <w:lsdException w:name="Light Shading Accent 4" w:uiPriority="60"/>
+    <w:lsdException w:name="Light List Accent 4" w:uiPriority="61"/>
+    <w:lsdException w:name="Light Grid Accent 4" w:uiPriority="62"/>
+    <w:lsdException w:name="Medium Shading 1 Accent 4" w:uiPriority="63"/>
+    <w:lsdException w:name="Medium Shading 2 Accent 4" w:uiPriority="64"/>
+    <w:lsdException w:name="Medium List 1 Accent 4" w:uiPriority="65"/>
+    <w:lsdException w:name="Medium List 2 Accent 4" w:uiPriority="66"/>
+    <w:lsdException w:name="Medium Grid 1 Accent 4" w:uiPriority="67"/>
+    <w:lsdException w:name="Medium Grid 2 Accent 4" w:uiPriority="68"/>
+    <w:lsdException w:name="Medium Grid 3 Accent 4" w:uiPriority="69"/>
+    <w:lsdException w:name="Dark List Accent 4" w:uiPriority="70"/>
+    <w:lsdException w:name="Colorful Shading Accent 4" w:uiPriority="71"/>
+    <w:lsdException w:name="Colorful List Accent 4" w:uiPriority="72"/>
+    <w:lsdException w:name="Colorful Grid Accent 4" w:uiPriority="73"/>
+    <w:lsdException w:name="Light Shading Accent 5" w:uiPriority="60"/>
+    <w:lsdException w:name="Light List Accent 5" w:uiPriority="61"/>
+    <w:lsdException w:name="Light Grid Accent 5" w:uiPriority="62"/>
+    <w:lsdException w:name="Medium Shading 1 Accent 5" w:uiPriority="63"/>
+    <w:lsdException w:name="Medium Shading 2 Accent 5" w:uiPriority="64"/>
+    <w:lsdException w:name="Medium List 1 Accent 5" w:uiPriority="65"/>
+    <w:lsdException w:name="Medium List 2 Accent 5" w:uiPriority="66"/>
+    <w:lsdException w:name="Medium Grid 1 Accent 5" w:uiPriority="67"/>
+    <w:lsdException w:name="Medium Grid 2 Accent 5" w:uiPriority="68"/>
+    <w:lsdException w:name="Medium Grid 3 Accent 5" w:uiPriority="69"/>
+    <w:lsdException w:name="Dark List Accent 5" w:uiPriority="70"/>
+    <w:lsdException w:name="Colorful Shading Accent 5" w:uiPriority="71"/>
+    <w:lsdException w:name="Colorful List Accent 5" w:uiPriority="72"/>
+    <w:lsdException w:name="Colorful Grid Accent 5" w:uiPriority="73"/>
+    <w:lsdException w:name="Light Shading Accent 6" w:uiPriority="60"/>
+    <w:lsdException w:name="Light List Accent 6" w:uiPriority="61"/>
+    <w:lsdException w:name="Light Grid Accent 6" w:uiPriority="62"/>
+    <w:lsdException w:name="Medium Shading 1 Accent 6" w:uiPriority="63"/>
+    <w:lsdException w:name="Medium Shading 2 Accent 6" w:uiPriority="64"/>
+    <w:lsdException w:name="Medium List 1 Accent 6" w:uiPriority="65"/>
+    <w:lsdException w:name="Medium List 2 Accent 6" w:uiPriority="66"/>
+    <w:lsdException w:name="Medium Grid 1 Accent 6" w:uiPriority="67"/>
+    <w:lsdException w:name="Medium Grid 2 Accent 6" w:uiPriority="68"/>
+    <w:lsdException w:name="Medium Grid 3 Accent 6" w:uiPriority="69"/>
+    <w:lsdException w:name="Dark List Accent 6" w:uiPriority="70"/>
+    <w:lsdException w:name="Colorful Shading Accent 6" w:uiPriority="71"/>
+    <w:lsdException w:name="Colorful List Accent 6" w:uiPriority="72"/>
+    <w:lsdException w:name="Colorful Grid Accent 6" w:uiPriority="73"/>
+    <w:lsdException w:name="Subtle Emphasis" w:uiPriority="19" w:qFormat="1"/>
+    <w:lsdException w:name="Intense Emphasis" w:uiPriority="21" w:qFormat="1"/>
+    <w:lsdException w:name="Subtle Reference" w:uiPriority="31" w:qFormat="1"/>
+    <w:lsdException w:name="Intense Reference" w:uiPriority="32" w:qFormat="1"/>
+    <w:lsdException w:name="Book Title" w:uiPriority="33" w:qFormat="1"/>
+    <w:lsdException w:name="Bibliography" w:semiHidden="1" w:uiPriority="37" w:unhideWhenUsed="1"/>
+    <w:lsdException w:name="TOC Heading" w:semiHidden="1" w:uiPriority="39" w:unhideWhenUsed="1" w:qFormat="1"/>
+    <w:lsdException w:name="Plain Table 1" w:uiPriority="41"/>
+    <w:lsdException w:name="Plain Table 2" w:uiPriority="42"/>
+    <w:lsdException w:name="Plain Table 3" w:uiPriority="43"/>
+    <w:lsdException w:name="Plain Table 4" w:uiPriority="44"/>
+    <w:lsdException w:name="Plain Table 5" w:uiPriority="45"/>
+    <w:lsdException w:name="Grid Table Light" w:uiPriority="40"/>
+    <w:lsdException w:name="Grid Table 1 Light" w:uiPriority="46"/>
+    <w:lsdException w:name="Grid Table 2" w:uiPriority="47"/>
+    <w:lsdException w:name="Grid Table 3" w:uiPriority="48"/>
+    <w:lsdException w:name="Grid Table 4" w:uiPriority="49"/>
+    <w:lsdException w:name="Grid Table 5 Dark" w:uiPriority="50"/>
+    <w:lsdException w:name="Grid Table 6 Colorful" w:uiPriority="51"/>
+    <w:lsdException w:name="Grid Table 7 Colorful" w:uiPriority="52"/>
+    <w:lsdException w:name="Grid Table 1 Light Accent 1" w:uiPriority="46"/>
+    <w:lsdException w:name="Grid Table 2 Accent 1" w:uiPriority="47"/>
+    <w:lsdException w:name="Grid Table 3 Accent 1" w:uiPriority="48"/>
+    <w:lsdException w:name="Grid Table 4 Accent 1" w:uiPriority="49"/>
+    <w:lsdException w:name="Grid Table 5 Dark Accent 1" w:uiPriority="50"/>
+    <w:lsdException w:name="Grid Table 6 Colorful Accent 1" w:uiPriority="51"/>
+    <w:lsdException w:name="Grid Table 7 Colorful Accent 1" w:uiPriority="52"/>
+    <w:lsdException w:name="Grid Table 1 Light Accent 2" w:uiPriority="46"/>
+    <w:lsdException w:name="Grid Table 2 Accent 2" w:uiPriority="47"/>
+    <w:lsdException w:name="Grid Table 3 Accent 2" w:uiPriority="48"/>
+    <w:lsdException w:name="Grid Table 4 Accent 2" w:uiPriority="49"/>
+    <w:lsdException w:name="Grid Table 5 Dark Accent 2" w:uiPriority="50"/>
+    <w:lsdException w:name="Grid Table 6 Colorful Accent 2" w:uiPriority="51"/>
+    <w:lsdException w:name="Grid Table 7 Colorful Accent 2" w:uiPriority="52"/>
+    <w:lsdException w:name="Grid Table 1 Light Accent 3" w:uiPriority="46"/>
+    <w:lsdException w:name="Grid Table 2 Accent 3" w:uiPriority="47"/>
+    <w:lsdException w:name="Grid Table 3 Accent 3" w:uiPriority="48"/>
+    <w:lsdException w:name="Grid Table 4 Accent 3" w:uiPriority="49"/>
+    <w:lsdException w:name="Grid Table 5 Dark Accent 3" w:uiPriority="50"/>
+    <w:lsdException w:name="Grid Table 6 Colorful Accent 3" w:uiPriority="51"/>
+    <w:lsdException w:name="Grid Table 7 Colorful Accent 3" w:uiPriority="52"/>
+    <w:lsdException w:name="Grid Table 1 Light Accent 4" w:uiPriority="46"/>
+    <w:lsdException w:name="Grid Table 2 Accent 4" w:uiPriority="47"/>
+    <w:lsdException w:name="Grid Table 3 Accent 4" w:uiPriority="48"/>
+    <w:lsdException w:name="Grid Table 4 Accent 4" w:uiPriority="49"/>
+    <w:lsdException w:name="Grid Table 5 Dark Accent 4" w:uiPriority="50"/>
+    <w:lsdException w:name="Grid Table 6 Colorful Accent 4" w:uiPriority="51"/>
+    <w:lsdException w:name="Grid Table 7 Colorful Accent 4" w:uiPriority="52"/>
+    <w:lsdException w:name="Grid Table 1 Light Accent 5" w:uiPriority="46"/>
+    <w:lsdException w:name="Grid Table 2 Accent 5" w:uiPriority="47"/>
+    <w:lsdException w:name="Grid Table 3 Accent 5" w:uiPriority="48"/>
+    <w:lsdException w:name="Grid Table 4 Accent 5" w:uiPriority="49"/>
+    <w:lsdException w:name="Grid Table 5 Dark Accent 5" w:uiPriority="50"/>
+    <w:lsdException w:name="Grid Table 6 Colorful Accent 5" w:uiPriority="51"/>
+    <w:lsdException w:name="Grid Table 7 Colorful Accent 5" w:uiPriority="52"/>
+    <w:lsdException w:name="Grid Table 1 Light Accent 6" w:uiPriority="46"/>
+    <w:lsdException w:name="Grid Table 2 Accent 6" w:uiPriority="47"/>
+    <w:lsdException w:name="Grid Table 3 Accent 6" w:uiPriority="48"/>
+    <w:lsdException w:name="Grid Table 4 Accent 6" w:uiPriority="49"/>
+    <w:lsdException w:name="Grid Table 5 Dark Accent 6" w:uiPriority="50"/>
+    <w:lsdException w:name="Grid Table 6 Colorful Accent 6" w:uiPriority="51"/>
+    <w:lsdException w:name="Grid Table 7 Colorful Accent 6" w:uiPriority="52"/>
+    <w:lsdException w:name="List Table 1 Light" w:uiPriority="46"/>
+    <w:lsdException w:name="List Table 2" w:uiPriority="47"/>
+    <w:lsdException w:name="List Table 3" w:uiPriority="48"/>
+    <w:lsdException w:name="List Table 4" w:uiPriority="49"/>
+    <w:lsdException w:name="List Table 5 Dark" w:uiPriority="50"/>
+    <w:lsdException w:name="List Table 6 Colorful" w:uiPriority="51"/>
+    <w:lsdException w:name="List Table 7 Colorful" w:uiPriority="52"/>
+    <w:lsdException w:name="List Table 1 Light Accent 1" w:uiPriority="46"/>
+    <w:lsdException w:name="List Table 2 Accent 1" w:uiPriority="47"/>
+    <w:lsdException w:name="List Table 3 Accent 1" w:uiPriority="48"/>
+    <w:lsdException w:name="List Table 4 Accent 1" w:uiPriority="49"/>
+    <w:lsdException w:name="List Table 5 Dark Accent 1" w:uiPriority="50"/>
+    <w:lsdException w:name="List Table 6 Colorful Accent 1" w:uiPriority="51"/>
+    <w:lsdException w:name="List Table 7 Colorful Accent 1" w:uiPriority="52"/>
+    <w:lsdException w:name="List Table 1 Light Accent 2" w:uiPriority="46"/>
+    <w:lsdException w:name="List Table 2 Accent 2" w:uiPriority="47"/>
+    <w:lsdException w:name="List Table 3 Accent 2" w:uiPriority="48"/>
+    <w:lsdException w:name="List Table 4 Accent 2" w:uiPriority="49"/>
+    <w:lsdException w:name="List Table 5 Dark Accent 2" w:uiPriority="50"/>
+    <w:lsdException w:name="List Table 6 Colorful Accent 2" w:uiPriority="51"/>
+    <w:lsdException w:name="List Table 7 Colorful Accent 2" w:uiPriority="52"/>
+    <w:lsdException w:name="List Table 1 Light Accent 3" w:uiPriority="46"/>
+    <w:lsdException w:name="List Table 2 Accent 3" w:uiPriority="47"/>
+    <w:lsdException w:name="List Table 3 Accent 3" w:uiPriority="48"/>
+    <w:lsdException w:name="List Table 4 Accent 3" w:uiPriority="49"/>
+    <w:lsdException w:name="List Table 5 Dark Accent 3" w:uiPriority="50"/>
+    <w:lsdException w:name="List Table 6 Colorful Accent 3" w:uiPriority="51"/>
+    <w:lsdException w:name="List Table 7 Colorful Accent 3" w:uiPriority="52"/>
+    <w:lsdException w:name="List Table 1 Light Accent 4" w:uiPriority="46"/>
+    <w:lsdException w:name="List Table 2 Accent 4" w:uiPriority="47"/>
+    <w:lsdException w:name="List Table 3 Accent 4" w:uiPriority="48"/>
+    <w:lsdException w:name="List Table 4 Accent 4" w:uiPriority="49"/>
+    <w:lsdException w:name="List Table 5 Dark Accent 4" w:uiPriority="50"/>
+    <w:lsdException w:name="List Table 6 Colorful Accent 4" w:uiPriority="51"/>
+    <w:lsdException w:name="List Table 7 Colorful Accent 4" w:uiPriority="52"/>
+    <w:lsdException w:name="List Table 1 Light Accent 5" w:uiPriority="46"/>
+    <w:lsdException w:name="List Table 2 Accent 5" w:uiPriority="47"/>
+    <w:lsdException w:name="List Table 3 Accent 5" w:uiPriority="48"/>
+    <w:lsdException w:name="List Table 4 Accent 5" w:uiPriority="49"/>
+    <w:lsdException w:name="List Table 5 Dark Accent 5" w:uiPriority="50"/>
+    <w:lsdException w:name="List Table 6 Colorful Accent 5" w:uiPriority="51"/>
+    <w:lsdException w:name="List Table 7 Colorful Accent 5" w:uiPriority="52"/>
+    <w:lsdException w:name="List Table 1 Light Accent 6" w:uiPriority="46"/>
+    <w:lsdException w:name="List Table 2 Accent 6" w:uiPriority="47"/>
+    <w:lsdException w:name="List Table 3 Accent 6" w:uiPriority="48"/>
+    <w:lsdException w:name="List Table 4 Accent 6" w:uiPriority="49"/>
+    <w:lsdException w:name="List Table 5 Dark Accent 6" w:uiPriority="50"/>
+    <w:lsdException w:name="List Table 6 Colorful Accent 6" w:uiPriority="51"/>
+    <w:lsdException w:name="List Table 7 Colorful Accent 6" w:uiPriority="52"/>
+    <w:lsdException w:name="Mention" w:semiHidden="1" w:unhideWhenUsed="1"/>
+    <w:lsdException w:name="Smart Hyperlink" w:semiHidden="1" w:unhideWhenUsed="1"/>
+    <w:lsdException w:name="Hashtag" w:semiHidden="1" w:unhideWhenUsed="1"/>
+    <w:lsdException w:name="Unresolved Mention" w:semiHidden="1" w:unhideWhenUsed="1"/>
+    <w:lsdException w:name="Smart Link" w:semiHidden="1" w:unhideWhenUsed="1"/>
   </w:latentStyles>
-  <w:style w:type="paragraph" w:default="1" w:styleId="Normal">
+  <w:style w:type="paragraph" w:default="1" w:styleId="Binhthng">
     <w:name w:val="Normal"/>
     <w:qFormat/>
     <w:rsid w:val="0035228D"/>
@@ -3654,18 +4241,17 @@
       <w:spacing w:after="0" w:line="300" w:lineRule="atLeast"/>
     </w:pPr>
   </w:style>
-  <w:style w:type="character" w:default="1" w:styleId="DefaultParagraphFont">
+  <w:style w:type="character" w:default="1" w:styleId="Phngmcinhcuaoanvn">
     <w:name w:val="Default Paragraph Font"/>
     <w:uiPriority w:val="1"/>
     <w:semiHidden/>
     <w:unhideWhenUsed/>
   </w:style>
-  <w:style w:type="table" w:default="1" w:styleId="TableNormal">
+  <w:style w:type="table" w:default="1" w:styleId="BangThngthng">
     <w:name w:val="Normal Table"/>
     <w:uiPriority w:val="99"/>
     <w:semiHidden/>
     <w:unhideWhenUsed/>
-    <w:qFormat/>
     <w:tblPr>
       <w:tblInd w:w="0" w:type="dxa"/>
       <w:tblCellMar>
@@ -3676,7 +4262,7 @@
       </w:tblCellMar>
     </w:tblPr>
   </w:style>
-  <w:style w:type="numbering" w:default="1" w:styleId="NoList">
+  <w:style w:type="numbering" w:default="1" w:styleId="Khngco">
     <w:name w:val="No List"/>
     <w:uiPriority w:val="99"/>
     <w:semiHidden/>
@@ -3684,12 +4270,12 @@
   </w:style>
   <w:style w:type="character" w:customStyle="1" w:styleId="apple-converted-space">
     <w:name w:val="apple-converted-space"/>
-    <w:basedOn w:val="DefaultParagraphFont"/>
+    <w:basedOn w:val="Phngmcinhcuaoanvn"/>
     <w:rsid w:val="0035228D"/>
   </w:style>
-  <w:style w:type="paragraph" w:styleId="ListParagraph">
+  <w:style w:type="paragraph" w:styleId="oancuaDanhsach">
     <w:name w:val="List Paragraph"/>
-    <w:basedOn w:val="Normal"/>
+    <w:basedOn w:val="Binhthng"/>
     <w:uiPriority w:val="34"/>
     <w:qFormat/>
     <w:rsid w:val="0035228D"/>
@@ -3698,16 +4284,15 @@
       <w:contextualSpacing/>
     </w:pPr>
   </w:style>
-  <w:style w:type="table" w:styleId="TableGrid">
+  <w:style w:type="table" w:styleId="LiBang">
     <w:name w:val="Table Grid"/>
-    <w:basedOn w:val="TableNormal"/>
+    <w:basedOn w:val="BangThngthng"/>
     <w:uiPriority w:val="39"/>
     <w:rsid w:val="00421062"/>
     <w:pPr>
       <w:spacing w:after="0" w:line="240" w:lineRule="auto"/>
     </w:pPr>
     <w:tblPr>
-      <w:tblInd w:w="0" w:type="dxa"/>
       <w:tblBorders>
         <w:top w:val="single" w:sz="4" w:space="0" w:color="auto"/>
         <w:left w:val="single" w:sz="4" w:space="0" w:color="auto"/>
@@ -3716,17 +4301,11 @@
         <w:insideH w:val="single" w:sz="4" w:space="0" w:color="auto"/>
         <w:insideV w:val="single" w:sz="4" w:space="0" w:color="auto"/>
       </w:tblBorders>
-      <w:tblCellMar>
-        <w:top w:w="0" w:type="dxa"/>
-        <w:left w:w="108" w:type="dxa"/>
-        <w:bottom w:w="0" w:type="dxa"/>
-        <w:right w:w="108" w:type="dxa"/>
-      </w:tblCellMar>
     </w:tblPr>
   </w:style>
-  <w:style w:type="character" w:styleId="PlaceholderText">
+  <w:style w:type="character" w:styleId="VnbanChdanhsn">
     <w:name w:val="Placeholder Text"/>
-    <w:basedOn w:val="DefaultParagraphFont"/>
+    <w:basedOn w:val="Phngmcinhcuaoanvn"/>
     <w:uiPriority w:val="99"/>
     <w:semiHidden/>
     <w:rsid w:val="000D79A5"/>
@@ -3734,9 +4313,9 @@
       <w:color w:val="808080"/>
     </w:rPr>
   </w:style>
-  <w:style w:type="character" w:styleId="Hyperlink">
+  <w:style w:type="character" w:styleId="Siuktni">
     <w:name w:val="Hyperlink"/>
-    <w:basedOn w:val="DefaultParagraphFont"/>
+    <w:basedOn w:val="Phngmcinhcuaoanvn"/>
     <w:uiPriority w:val="99"/>
     <w:semiHidden/>
     <w:unhideWhenUsed/>
@@ -3746,9 +4325,9 @@
       <w:u w:val="single"/>
     </w:rPr>
   </w:style>
-  <w:style w:type="paragraph" w:styleId="NormalWeb">
+  <w:style w:type="paragraph" w:styleId="ThngthngWeb">
     <w:name w:val="Normal (Web)"/>
-    <w:basedOn w:val="Normal"/>
+    <w:basedOn w:val="Binhthng"/>
     <w:uiPriority w:val="99"/>
     <w:semiHidden/>
     <w:unhideWhenUsed/>
@@ -3763,10 +4342,10 @@
       <w:lang w:eastAsia="ja-JP"/>
     </w:rPr>
   </w:style>
-  <w:style w:type="paragraph" w:styleId="BalloonText">
+  <w:style w:type="paragraph" w:styleId="Bongchuthich">
     <w:name w:val="Balloon Text"/>
-    <w:basedOn w:val="Normal"/>
-    <w:link w:val="BalloonTextChar"/>
+    <w:basedOn w:val="Binhthng"/>
+    <w:link w:val="BongchuthichChar"/>
     <w:uiPriority w:val="99"/>
     <w:semiHidden/>
     <w:unhideWhenUsed/>
@@ -3780,10 +4359,10 @@
       <w:szCs w:val="16"/>
     </w:rPr>
   </w:style>
-  <w:style w:type="character" w:customStyle="1" w:styleId="BalloonTextChar">
-    <w:name w:val="Balloon Text Char"/>
-    <w:basedOn w:val="DefaultParagraphFont"/>
-    <w:link w:val="BalloonText"/>
+  <w:style w:type="character" w:customStyle="1" w:styleId="BongchuthichChar">
+    <w:name w:val="Bóng chú thích Char"/>
+    <w:basedOn w:val="Phngmcinhcuaoanvn"/>
+    <w:link w:val="Bongchuthich"/>
     <w:uiPriority w:val="99"/>
     <w:semiHidden/>
     <w:rsid w:val="00A4072A"/>
@@ -4055,7 +4634,7 @@
   <a:extraClrSchemeLst/>
   <a:extLst>
     <a:ext uri="{05A4C25C-085E-4340-85A3-A5531E510DB2}">
-      <thm15:themeFamily xmlns="" xmlns:thm15="http://schemas.microsoft.com/office/thememl/2012/main" name="Office Theme" id="{62F939B6-93AF-4DB8-9C6B-D6C7DFDC589F}" vid="{4A3C46E8-61CC-4603-A589-7422A47A8E4A}"/>
+      <thm15:themeFamily xmlns:thm15="http://schemas.microsoft.com/office/thememl/2012/main" name="Office Theme" id="{62F939B6-93AF-4DB8-9C6B-D6C7DFDC589F}" vid="{4A3C46E8-61CC-4603-A589-7422A47A8E4A}"/>
     </a:ext>
   </a:extLst>
 </a:theme>

</xml_diff>